<commit_message>
Update research papers and add new files
</commit_message>
<xml_diff>
--- a/papers/2025/A COMPARATIVE ANALYSIS OF PERSONALITY TYPOLOGIES/Сравнительный анализ типологий личности MBTI, соционика и 16-факторный опросник Кеттелла.docx
+++ b/papers/2025/A COMPARATIVE ANALYSIS OF PERSONALITY TYPOLOGIES/Сравнительный анализ типологий личности MBTI, соционика и 16-факторный опросник Кеттелла.docx
@@ -139,34 +139,14 @@
                 <w:lang w:val="ru-RU"/>
               </w:rPr>
             </w:pPr>
-            <w:proofErr w:type="spellStart"/>
             <w:r>
               <w:rPr>
                 <w:b/>
                 <w:sz w:val="20"/>
                 <w:szCs w:val="20"/>
               </w:rPr>
-              <w:t>Заголовок</w:t>
+              <w:t>Заголовок статьи</w:t>
             </w:r>
-            <w:proofErr w:type="spellEnd"/>
-            <w:r>
-              <w:rPr>
-                <w:b/>
-                <w:sz w:val="20"/>
-                <w:szCs w:val="20"/>
-              </w:rPr>
-              <w:t xml:space="preserve"> </w:t>
-            </w:r>
-            <w:proofErr w:type="spellStart"/>
-            <w:r>
-              <w:rPr>
-                <w:b/>
-                <w:sz w:val="20"/>
-                <w:szCs w:val="20"/>
-              </w:rPr>
-              <w:t>статьи</w:t>
-            </w:r>
-            <w:proofErr w:type="spellEnd"/>
           </w:p>
         </w:tc>
         <w:tc>
@@ -225,7 +205,6 @@
                 <w:lang w:val="ru-RU"/>
               </w:rPr>
             </w:pPr>
-            <w:proofErr w:type="spellStart"/>
             <w:r>
               <w:rPr>
                 <w:b/>
@@ -234,7 +213,6 @@
               </w:rPr>
               <w:t>Секция</w:t>
             </w:r>
-            <w:proofErr w:type="spellEnd"/>
           </w:p>
         </w:tc>
         <w:tc>
@@ -266,77 +244,13 @@
                 <w:lang w:val="ru-RU"/>
               </w:rPr>
             </w:pPr>
-            <w:proofErr w:type="spellStart"/>
             <w:r>
               <w:rPr>
                 <w:b/>
                 <w:sz w:val="20"/>
                 <w:szCs w:val="20"/>
               </w:rPr>
-              <w:t>Форма</w:t>
-            </w:r>
-            <w:proofErr w:type="spellEnd"/>
-            <w:r>
-              <w:rPr>
-                <w:b/>
-                <w:sz w:val="20"/>
-                <w:szCs w:val="20"/>
-              </w:rPr>
-              <w:t xml:space="preserve"> </w:t>
-            </w:r>
-            <w:proofErr w:type="spellStart"/>
-            <w:r>
-              <w:rPr>
-                <w:b/>
-                <w:sz w:val="20"/>
-                <w:szCs w:val="20"/>
-              </w:rPr>
-              <w:t>участия</w:t>
-            </w:r>
-            <w:proofErr w:type="spellEnd"/>
-            <w:r>
-              <w:rPr>
-                <w:b/>
-                <w:sz w:val="20"/>
-                <w:szCs w:val="20"/>
-              </w:rPr>
-              <w:t xml:space="preserve"> (</w:t>
-            </w:r>
-            <w:proofErr w:type="spellStart"/>
-            <w:r>
-              <w:rPr>
-                <w:b/>
-                <w:sz w:val="20"/>
-                <w:szCs w:val="20"/>
-              </w:rPr>
-              <w:t>очная</w:t>
-            </w:r>
-            <w:proofErr w:type="spellEnd"/>
-            <w:r>
-              <w:rPr>
-                <w:b/>
-                <w:sz w:val="20"/>
-                <w:szCs w:val="20"/>
-              </w:rPr>
-              <w:t xml:space="preserve">, </w:t>
-            </w:r>
-            <w:proofErr w:type="spellStart"/>
-            <w:r>
-              <w:rPr>
-                <w:b/>
-                <w:sz w:val="20"/>
-                <w:szCs w:val="20"/>
-              </w:rPr>
-              <w:t>заочная</w:t>
-            </w:r>
-            <w:proofErr w:type="spellEnd"/>
-            <w:r>
-              <w:rPr>
-                <w:b/>
-                <w:sz w:val="20"/>
-                <w:szCs w:val="20"/>
-              </w:rPr>
-              <w:t>)</w:t>
+              <w:t>Форма участия (очная, заочная)</w:t>
             </w:r>
           </w:p>
         </w:tc>
@@ -379,52 +293,14 @@
                 <w:lang w:val="ru-RU"/>
               </w:rPr>
             </w:pPr>
-            <w:proofErr w:type="spellStart"/>
             <w:r>
               <w:rPr>
                 <w:b/>
                 <w:sz w:val="20"/>
                 <w:szCs w:val="20"/>
               </w:rPr>
-              <w:t>Требуется</w:t>
+              <w:t>Требуется сертификат участника</w:t>
             </w:r>
-            <w:proofErr w:type="spellEnd"/>
-            <w:r>
-              <w:rPr>
-                <w:b/>
-                <w:sz w:val="20"/>
-                <w:szCs w:val="20"/>
-              </w:rPr>
-              <w:t xml:space="preserve"> </w:t>
-            </w:r>
-            <w:proofErr w:type="spellStart"/>
-            <w:r>
-              <w:rPr>
-                <w:b/>
-                <w:sz w:val="20"/>
-                <w:szCs w:val="20"/>
-              </w:rPr>
-              <w:t>сертификат</w:t>
-            </w:r>
-            <w:proofErr w:type="spellEnd"/>
-            <w:r>
-              <w:rPr>
-                <w:b/>
-                <w:sz w:val="20"/>
-                <w:szCs w:val="20"/>
-              </w:rPr>
-              <w:t xml:space="preserve"> </w:t>
-            </w:r>
-            <w:proofErr w:type="spellStart"/>
-            <w:r>
-              <w:rPr>
-                <w:b/>
-                <w:sz w:val="20"/>
-                <w:szCs w:val="20"/>
-              </w:rPr>
-              <w:t>участника</w:t>
-            </w:r>
-            <w:proofErr w:type="spellEnd"/>
           </w:p>
         </w:tc>
         <w:tc>
@@ -440,7 +316,6 @@
                 <w:lang w:val="ru-RU"/>
               </w:rPr>
             </w:pPr>
-            <w:proofErr w:type="spellStart"/>
             <w:r>
               <w:rPr>
                 <w:b/>
@@ -449,25 +324,14 @@
               </w:rPr>
               <w:t>да</w:t>
             </w:r>
-            <w:proofErr w:type="spellEnd"/>
             <w:r>
               <w:rPr>
                 <w:bCs/>
                 <w:sz w:val="20"/>
                 <w:szCs w:val="20"/>
               </w:rPr>
-              <w:t>/</w:t>
+              <w:t>/нет</w:t>
             </w:r>
-            <w:proofErr w:type="spellStart"/>
-            <w:r>
-              <w:rPr>
-                <w:bCs/>
-                <w:sz w:val="20"/>
-                <w:szCs w:val="20"/>
-              </w:rPr>
-              <w:t>нет</w:t>
-            </w:r>
-            <w:proofErr w:type="spellEnd"/>
           </w:p>
         </w:tc>
       </w:tr>
@@ -509,7 +373,6 @@
                 <w:lang w:val="ru-RU"/>
               </w:rPr>
             </w:pPr>
-            <w:proofErr w:type="spellStart"/>
             <w:r>
               <w:rPr>
                 <w:b/>
@@ -518,25 +381,14 @@
               </w:rPr>
               <w:t>да</w:t>
             </w:r>
-            <w:proofErr w:type="spellEnd"/>
             <w:r>
               <w:rPr>
                 <w:bCs/>
                 <w:sz w:val="20"/>
                 <w:szCs w:val="20"/>
               </w:rPr>
-              <w:t>/</w:t>
+              <w:t>/нет</w:t>
             </w:r>
-            <w:proofErr w:type="spellStart"/>
-            <w:r>
-              <w:rPr>
-                <w:bCs/>
-                <w:sz w:val="20"/>
-                <w:szCs w:val="20"/>
-              </w:rPr>
-              <w:t>нет</w:t>
-            </w:r>
-            <w:proofErr w:type="spellEnd"/>
           </w:p>
         </w:tc>
       </w:tr>
@@ -554,52 +406,14 @@
                 <w:lang w:val="ru-RU"/>
               </w:rPr>
             </w:pPr>
-            <w:proofErr w:type="spellStart"/>
             <w:r>
               <w:rPr>
                 <w:b/>
                 <w:sz w:val="20"/>
                 <w:szCs w:val="20"/>
               </w:rPr>
-              <w:t>Учебное</w:t>
+              <w:t>Учебное заведение, организация</w:t>
             </w:r>
-            <w:proofErr w:type="spellEnd"/>
-            <w:r>
-              <w:rPr>
-                <w:b/>
-                <w:sz w:val="20"/>
-                <w:szCs w:val="20"/>
-              </w:rPr>
-              <w:t xml:space="preserve"> </w:t>
-            </w:r>
-            <w:proofErr w:type="spellStart"/>
-            <w:r>
-              <w:rPr>
-                <w:b/>
-                <w:sz w:val="20"/>
-                <w:szCs w:val="20"/>
-              </w:rPr>
-              <w:t>заведение</w:t>
-            </w:r>
-            <w:proofErr w:type="spellEnd"/>
-            <w:r>
-              <w:rPr>
-                <w:b/>
-                <w:sz w:val="20"/>
-                <w:szCs w:val="20"/>
-              </w:rPr>
-              <w:t xml:space="preserve">, </w:t>
-            </w:r>
-            <w:proofErr w:type="spellStart"/>
-            <w:r>
-              <w:rPr>
-                <w:b/>
-                <w:sz w:val="20"/>
-                <w:szCs w:val="20"/>
-              </w:rPr>
-              <w:t>организация</w:t>
-            </w:r>
-            <w:proofErr w:type="spellEnd"/>
           </w:p>
         </w:tc>
         <w:tc>
@@ -688,7 +502,6 @@
                 <w:lang w:val="ru-RU"/>
               </w:rPr>
             </w:pPr>
-            <w:proofErr w:type="spellStart"/>
             <w:r>
               <w:rPr>
                 <w:b/>
@@ -697,7 +510,6 @@
               </w:rPr>
               <w:t>Телефон</w:t>
             </w:r>
-            <w:proofErr w:type="spellEnd"/>
           </w:p>
         </w:tc>
         <w:tc>
@@ -739,34 +551,14 @@
                 <w:lang w:val="ru-RU"/>
               </w:rPr>
             </w:pPr>
-            <w:proofErr w:type="spellStart"/>
             <w:r>
               <w:rPr>
                 <w:b/>
                 <w:sz w:val="20"/>
                 <w:szCs w:val="20"/>
               </w:rPr>
-              <w:t>Электронная</w:t>
+              <w:t>Электронная почта</w:t>
             </w:r>
-            <w:proofErr w:type="spellEnd"/>
-            <w:r>
-              <w:rPr>
-                <w:b/>
-                <w:sz w:val="20"/>
-                <w:szCs w:val="20"/>
-              </w:rPr>
-              <w:t xml:space="preserve"> </w:t>
-            </w:r>
-            <w:proofErr w:type="spellStart"/>
-            <w:r>
-              <w:rPr>
-                <w:b/>
-                <w:sz w:val="20"/>
-                <w:szCs w:val="20"/>
-              </w:rPr>
-              <w:t>почта</w:t>
-            </w:r>
-            <w:proofErr w:type="spellEnd"/>
           </w:p>
         </w:tc>
         <w:tc>
@@ -806,34 +598,14 @@
                 <w:lang w:val="ru-RU"/>
               </w:rPr>
             </w:pPr>
-            <w:proofErr w:type="spellStart"/>
             <w:r>
               <w:rPr>
                 <w:b/>
                 <w:sz w:val="20"/>
                 <w:szCs w:val="20"/>
               </w:rPr>
-              <w:t>Почтовый</w:t>
+              <w:t>Почтовый адрес</w:t>
             </w:r>
-            <w:proofErr w:type="spellEnd"/>
-            <w:r>
-              <w:rPr>
-                <w:b/>
-                <w:sz w:val="20"/>
-                <w:szCs w:val="20"/>
-              </w:rPr>
-              <w:t xml:space="preserve"> </w:t>
-            </w:r>
-            <w:proofErr w:type="spellStart"/>
-            <w:r>
-              <w:rPr>
-                <w:b/>
-                <w:sz w:val="20"/>
-                <w:szCs w:val="20"/>
-              </w:rPr>
-              <w:t>адрес</w:t>
-            </w:r>
-            <w:proofErr w:type="spellEnd"/>
           </w:p>
         </w:tc>
         <w:tc>
@@ -1170,6 +942,12 @@
       </w:r>
       <w:r>
         <w:rPr>
+          <w:rStyle w:val="a3"/>
+        </w:rPr>
+        <w:footnoteReference w:id="1"/>
+      </w:r>
+      <w:r>
+        <w:rPr>
           <w:lang w:val="ru-RU"/>
         </w:rPr>
         <w:br/>
@@ -1245,14 +1023,12 @@
         <w:t xml:space="preserve"> </w:t>
       </w:r>
       <w:hyperlink r:id="rId10" w:history="1">
-        <w:proofErr w:type="spellStart"/>
         <w:r>
           <w:rPr>
             <w:rStyle w:val="a4"/>
           </w:rPr>
           <w:t>QuadDarv</w:t>
         </w:r>
-        <w:proofErr w:type="spellEnd"/>
         <w:r>
           <w:rPr>
             <w:rStyle w:val="a4"/>
@@ -1329,21 +1105,7 @@
         <w:rPr>
           <w:lang w:val="ru-RU"/>
         </w:rPr>
-        <w:t xml:space="preserve">), соционики и 16-факторного опросника личности Р. </w:t>
-      </w:r>
-      <w:proofErr w:type="spellStart"/>
-      <w:r>
-        <w:rPr>
-          <w:lang w:val="ru-RU"/>
-        </w:rPr>
-        <w:t>Кеттелла</w:t>
-      </w:r>
-      <w:proofErr w:type="spellEnd"/>
-      <w:r>
-        <w:rPr>
-          <w:lang w:val="ru-RU"/>
-        </w:rPr>
-        <w:t xml:space="preserve"> (16</w:t>
+        <w:t>), соционики и 16-факторного опросника личности Р. Кеттелла (16</w:t>
       </w:r>
       <w:r>
         <w:t>PF</w:t>
@@ -1376,35 +1138,7 @@
         <w:rPr>
           <w:lang w:val="ru-RU"/>
         </w:rPr>
-        <w:t>Рассматриваются теоретические основания каждой модели (</w:t>
-      </w:r>
-      <w:proofErr w:type="spellStart"/>
-      <w:r>
-        <w:rPr>
-          <w:lang w:val="ru-RU"/>
-        </w:rPr>
-        <w:t>юнгианская</w:t>
-      </w:r>
-      <w:proofErr w:type="spellEnd"/>
-      <w:r>
-        <w:rPr>
-          <w:lang w:val="ru-RU"/>
-        </w:rPr>
-        <w:t xml:space="preserve"> типология, концепция информационного метаболизма, </w:t>
-      </w:r>
-      <w:proofErr w:type="spellStart"/>
-      <w:r>
-        <w:rPr>
-          <w:lang w:val="ru-RU"/>
-        </w:rPr>
-        <w:t>факторно</w:t>
-      </w:r>
-      <w:proofErr w:type="spellEnd"/>
-      <w:r>
-        <w:rPr>
-          <w:lang w:val="ru-RU"/>
-        </w:rPr>
-        <w:t>-аналитический подход), структура шкал и способы интерпретации результатов, а также обсуждается уровень их психометрической обоснованности.</w:t>
+        <w:t>Рассматриваются теоретические основания каждой модели (юнгианская типология, концепция информационного метаболизма, факторно-аналитический подход), структура шкал и способы интерпретации результатов, а также обсуждается уровень их психометрической обоснованности.</w:t>
       </w:r>
     </w:p>
     <w:p>
@@ -1544,21 +1278,7 @@
         <w:rPr>
           <w:lang w:val="ru-RU"/>
         </w:rPr>
-        <w:t xml:space="preserve">; опросник </w:t>
-      </w:r>
-      <w:proofErr w:type="spellStart"/>
-      <w:r>
-        <w:rPr>
-          <w:lang w:val="ru-RU"/>
-        </w:rPr>
-        <w:t>Кеттелла</w:t>
-      </w:r>
-      <w:proofErr w:type="spellEnd"/>
-      <w:r>
-        <w:rPr>
-          <w:lang w:val="ru-RU"/>
-        </w:rPr>
-        <w:t>; дифференциальная психология; психодиагностика; личностные черты; психометрические свойства; валидность и надежность тестов.</w:t>
+        <w:t>; опросник Кеттелла; дифференциальная психология; психодиагностика; личностные черты; психометрические свойства; валидность и надежность тестов.</w:t>
       </w:r>
     </w:p>
     <w:p>
@@ -2366,21 +2086,7 @@
           <w:lang w:val="ru-RU"/>
         </w:rPr>
         <w:br/>
-        <w:t xml:space="preserve">2.2. </w:t>
-      </w:r>
-      <w:proofErr w:type="spellStart"/>
-      <w:r>
-        <w:rPr>
-          <w:lang w:val="ru-RU"/>
-        </w:rPr>
-        <w:t>Юнгианская</w:t>
-      </w:r>
-      <w:proofErr w:type="spellEnd"/>
-      <w:r>
-        <w:rPr>
-          <w:lang w:val="ru-RU"/>
-        </w:rPr>
-        <w:t xml:space="preserve"> теория психологических типов как база MBTI и соционики</w:t>
+        <w:t>2.2. Юнгианская теория психологических типов как база MBTI и соционики</w:t>
       </w:r>
       <w:r>
         <w:rPr>
@@ -2394,56 +2100,14 @@
           <w:lang w:val="ru-RU"/>
         </w:rPr>
         <w:br/>
-        <w:t xml:space="preserve">Ограничения </w:t>
-      </w:r>
-      <w:proofErr w:type="spellStart"/>
-      <w:r>
-        <w:rPr>
-          <w:lang w:val="ru-RU"/>
-        </w:rPr>
-        <w:t>юнгианской</w:t>
-      </w:r>
-      <w:proofErr w:type="spellEnd"/>
-      <w:r>
-        <w:rPr>
-          <w:lang w:val="ru-RU"/>
-        </w:rPr>
-        <w:t xml:space="preserve"> типологии с точки зрения современной науки.</w:t>
+        <w:t>Ограничения юнгианской типологии с точки зрения современной науки.</w:t>
       </w:r>
       <w:r>
         <w:rPr>
           <w:lang w:val="ru-RU"/>
         </w:rPr>
         <w:br/>
-        <w:t xml:space="preserve">2.3. </w:t>
-      </w:r>
-      <w:proofErr w:type="spellStart"/>
-      <w:r>
-        <w:rPr>
-          <w:lang w:val="ru-RU"/>
-        </w:rPr>
-        <w:t>Факторно</w:t>
-      </w:r>
-      <w:proofErr w:type="spellEnd"/>
-      <w:r>
-        <w:rPr>
-          <w:lang w:val="ru-RU"/>
-        </w:rPr>
-        <w:t xml:space="preserve">-аналитический подход Р. </w:t>
-      </w:r>
-      <w:proofErr w:type="spellStart"/>
-      <w:r>
-        <w:rPr>
-          <w:lang w:val="ru-RU"/>
-        </w:rPr>
-        <w:t>Кеттелла</w:t>
-      </w:r>
-      <w:proofErr w:type="spellEnd"/>
-      <w:r>
-        <w:rPr>
-          <w:lang w:val="ru-RU"/>
-        </w:rPr>
-        <w:t xml:space="preserve"> и модель 16PF</w:t>
+        <w:t>2.3. Факторно-аналитический подход Р. Кеттелла и модель 16PF</w:t>
       </w:r>
       <w:r>
         <w:rPr>
@@ -2527,21 +2191,7 @@
           <w:lang w:val="ru-RU"/>
         </w:rPr>
         <w:br/>
-        <w:t>Ограниченная валидность и риск упрощённого «</w:t>
-      </w:r>
-      <w:proofErr w:type="spellStart"/>
-      <w:r>
-        <w:rPr>
-          <w:lang w:val="ru-RU"/>
-        </w:rPr>
-        <w:t>ярлыкования</w:t>
-      </w:r>
-      <w:proofErr w:type="spellEnd"/>
-      <w:r>
-        <w:rPr>
-          <w:lang w:val="ru-RU"/>
-        </w:rPr>
-        <w:t>» личности.</w:t>
+        <w:t>Ограниченная валидность и риск упрощённого «ярлыкования» личности.</w:t>
       </w:r>
     </w:p>
     <w:p>
@@ -2560,21 +2210,7 @@
         <w:rPr>
           <w:lang w:val="ru-RU"/>
         </w:rPr>
-        <w:t xml:space="preserve">Соционика как развитие </w:t>
-      </w:r>
-      <w:proofErr w:type="spellStart"/>
-      <w:r>
-        <w:rPr>
-          <w:lang w:val="ru-RU"/>
-        </w:rPr>
-        <w:t>юнгианской</w:t>
-      </w:r>
-      <w:proofErr w:type="spellEnd"/>
-      <w:r>
-        <w:rPr>
-          <w:lang w:val="ru-RU"/>
-        </w:rPr>
-        <w:t xml:space="preserve"> типологии</w:t>
+        <w:t>Соционика как развитие юнгианской типологии</w:t>
       </w:r>
       <w:r>
         <w:rPr>
@@ -2602,56 +2238,14 @@
           <w:lang w:val="ru-RU"/>
         </w:rPr>
         <w:br/>
-        <w:t xml:space="preserve">4.2. </w:t>
-      </w:r>
-      <w:proofErr w:type="spellStart"/>
-      <w:r>
-        <w:rPr>
-          <w:lang w:val="ru-RU"/>
-        </w:rPr>
-        <w:t>Межтипные</w:t>
-      </w:r>
-      <w:proofErr w:type="spellEnd"/>
-      <w:r>
-        <w:rPr>
-          <w:lang w:val="ru-RU"/>
-        </w:rPr>
-        <w:t xml:space="preserve"> отношения и практическое использование соционики</w:t>
+        <w:t>4.2. Межтипные отношения и практическое использование соционики</w:t>
       </w:r>
       <w:r>
         <w:rPr>
           <w:lang w:val="ru-RU"/>
         </w:rPr>
         <w:br/>
-        <w:t xml:space="preserve">Концепция </w:t>
-      </w:r>
-      <w:proofErr w:type="spellStart"/>
-      <w:r>
-        <w:rPr>
-          <w:lang w:val="ru-RU"/>
-        </w:rPr>
-        <w:t>межтипных</w:t>
-      </w:r>
-      <w:proofErr w:type="spellEnd"/>
-      <w:r>
-        <w:rPr>
-          <w:lang w:val="ru-RU"/>
-        </w:rPr>
-        <w:t xml:space="preserve"> отношений (</w:t>
-      </w:r>
-      <w:proofErr w:type="spellStart"/>
-      <w:r>
-        <w:rPr>
-          <w:lang w:val="ru-RU"/>
-        </w:rPr>
-        <w:t>дуальность</w:t>
-      </w:r>
-      <w:proofErr w:type="spellEnd"/>
-      <w:r>
-        <w:rPr>
-          <w:lang w:val="ru-RU"/>
-        </w:rPr>
-        <w:t>, конфликт, ревизия и др.).</w:t>
+        <w:t>Концепция межтипных отношений (дуальность, конфликт, ревизия и др.).</w:t>
       </w:r>
       <w:r>
         <w:rPr>
@@ -2677,21 +2271,7 @@
         <w:rPr>
           <w:lang w:val="ru-RU"/>
         </w:rPr>
-        <w:t xml:space="preserve">16-факторный опросник личности </w:t>
-      </w:r>
-      <w:proofErr w:type="spellStart"/>
-      <w:r>
-        <w:rPr>
-          <w:lang w:val="ru-RU"/>
-        </w:rPr>
-        <w:t>Кеттелла</w:t>
-      </w:r>
-      <w:proofErr w:type="spellEnd"/>
-      <w:r>
-        <w:rPr>
-          <w:lang w:val="ru-RU"/>
-        </w:rPr>
-        <w:t xml:space="preserve"> (16PF)</w:t>
+        <w:t>16-факторный опросник личности Кеттелла (16PF)</w:t>
       </w:r>
       <w:r>
         <w:rPr>
@@ -2773,56 +2353,14 @@
           <w:lang w:val="ru-RU"/>
         </w:rPr>
         <w:br/>
-        <w:t xml:space="preserve">Общие </w:t>
-      </w:r>
-      <w:proofErr w:type="spellStart"/>
-      <w:r>
-        <w:rPr>
-          <w:lang w:val="ru-RU"/>
-        </w:rPr>
-        <w:t>юнгианские</w:t>
-      </w:r>
-      <w:proofErr w:type="spellEnd"/>
-      <w:r>
-        <w:rPr>
-          <w:lang w:val="ru-RU"/>
-        </w:rPr>
-        <w:t xml:space="preserve"> корни MBTI и соционики против </w:t>
-      </w:r>
-      <w:proofErr w:type="spellStart"/>
-      <w:r>
-        <w:rPr>
-          <w:lang w:val="ru-RU"/>
-        </w:rPr>
-        <w:t>факторно</w:t>
-      </w:r>
-      <w:proofErr w:type="spellEnd"/>
-      <w:r>
-        <w:rPr>
-          <w:lang w:val="ru-RU"/>
-        </w:rPr>
-        <w:t>-аналитического подхода 16PF.</w:t>
+        <w:t>Общие юнгианские корни MBTI и соционики против факторно-аналитического подхода 16PF.</w:t>
       </w:r>
       <w:r>
         <w:rPr>
           <w:lang w:val="ru-RU"/>
         </w:rPr>
         <w:br/>
-        <w:t xml:space="preserve">Тип </w:t>
-      </w:r>
-      <w:proofErr w:type="spellStart"/>
-      <w:r>
-        <w:rPr>
-          <w:lang w:val="ru-RU"/>
-        </w:rPr>
-        <w:t>vs</w:t>
-      </w:r>
-      <w:proofErr w:type="spellEnd"/>
-      <w:r>
-        <w:rPr>
-          <w:lang w:val="ru-RU"/>
-        </w:rPr>
-        <w:t>. черта: категориальные и континуальные модели личности.</w:t>
+        <w:t>Тип vs. черта: категориальные и континуальные модели личности.</w:t>
       </w:r>
       <w:r>
         <w:rPr>
@@ -2843,21 +2381,7 @@
           <w:lang w:val="ru-RU"/>
         </w:rPr>
         <w:br/>
-        <w:t xml:space="preserve">Рекомендации по использованию: популярная самооценка и тренинги (MBTI, соционика) </w:t>
-      </w:r>
-      <w:proofErr w:type="spellStart"/>
-      <w:r>
-        <w:rPr>
-          <w:lang w:val="ru-RU"/>
-        </w:rPr>
-        <w:t>vs</w:t>
-      </w:r>
-      <w:proofErr w:type="spellEnd"/>
-      <w:r>
-        <w:rPr>
-          <w:lang w:val="ru-RU"/>
-        </w:rPr>
-        <w:t>. профессиональная психодиагностика и научные исследования (16PF).</w:t>
+        <w:t>Рекомендации по использованию: популярная самооценка и тренинги (MBTI, соционика) vs. профессиональная психодиагностика и научные исследования (16PF).</w:t>
       </w:r>
     </w:p>
     <w:p>
@@ -2890,21 +2414,7 @@
           <w:lang w:val="ru-RU"/>
         </w:rPr>
         <w:br/>
-        <w:t xml:space="preserve">Ограничения работы и перспективы дальнейших исследований (например, сравнение 16PF с Big </w:t>
-      </w:r>
-      <w:proofErr w:type="spellStart"/>
-      <w:r>
-        <w:rPr>
-          <w:lang w:val="ru-RU"/>
-        </w:rPr>
-        <w:t>Five</w:t>
-      </w:r>
-      <w:proofErr w:type="spellEnd"/>
-      <w:r>
-        <w:rPr>
-          <w:lang w:val="ru-RU"/>
-        </w:rPr>
-        <w:t xml:space="preserve"> или эмпирическая проверка связи между типами MBTI/соционики и факторами 16PF).</w:t>
+        <w:t>Ограничения работы и перспективы дальнейших исследований (например, сравнение 16PF с Big Five или эмпирическая проверка связи между типами MBTI/соционики и факторами 16PF).</w:t>
       </w:r>
     </w:p>
     <w:p>
@@ -3018,61 +2528,182 @@
           <w:bCs/>
           <w:lang w:val="ru-RU"/>
         </w:rPr>
-        <w:t>MBTI (</w:t>
-      </w:r>
-      <w:proofErr w:type="spellStart"/>
+        <w:t>MBTI (Myers–Briggs Type Indicator)</w:t>
+      </w:r>
+      <w:r>
+        <w:rPr>
+          <w:lang w:val="ru-RU"/>
+        </w:rPr>
+        <w:t xml:space="preserve"> </w:t>
+      </w:r>
+      <w:r>
+        <w:rPr>
+          <w:lang w:val="ru-RU"/>
+        </w:rPr>
+        <w:t>– опросник, основанный на юнгианской типологии, описывающий личность по четырём дихотомиям (E–I, S–N, T–F, J–P) и выделяющий 16 типов, например INTJ, ESFP.</w:t>
+      </w:r>
+    </w:p>
+    <w:p>
+      <w:pPr>
+        <w:spacing w:after="0"/>
+        <w:ind w:firstLine="709"/>
+        <w:rPr>
+          <w:lang w:val="ru-RU"/>
+        </w:rPr>
+      </w:pPr>
       <w:r>
         <w:rPr>
           <w:b/>
           <w:bCs/>
           <w:lang w:val="ru-RU"/>
         </w:rPr>
-        <w:t>Myers</w:t>
-      </w:r>
-      <w:proofErr w:type="spellEnd"/>
+        <w:t>Экстраверсия / интроверсия (E/I)</w:t>
+      </w:r>
+      <w:r>
+        <w:rPr>
+          <w:lang w:val="ru-RU"/>
+        </w:rPr>
+        <w:t xml:space="preserve"> </w:t>
+      </w:r>
+      <w:r>
+        <w:rPr>
+          <w:lang w:val="ru-RU"/>
+        </w:rPr>
+        <w:t>– дихотомия в MBTI и соционике, описывающая преимущественную направленность психической энергии на внешний мир людей и событий (экстраверсия) или на внутренний мир мыслей и переживаний (интроверсия).</w:t>
+      </w:r>
+    </w:p>
+    <w:p>
+      <w:pPr>
+        <w:spacing w:after="0"/>
+        <w:ind w:firstLine="709"/>
+        <w:rPr>
+          <w:lang w:val="ru-RU"/>
+        </w:rPr>
+      </w:pPr>
       <w:r>
         <w:rPr>
           <w:b/>
           <w:bCs/>
           <w:lang w:val="ru-RU"/>
         </w:rPr>
-        <w:t>–</w:t>
-      </w:r>
-      <w:proofErr w:type="spellStart"/>
+        <w:t>Ощущение / интуиция (S/N)</w:t>
+      </w:r>
+      <w:r>
+        <w:rPr>
+          <w:lang w:val="ru-RU"/>
+        </w:rPr>
+        <w:t xml:space="preserve"> </w:t>
+      </w:r>
+      <w:r>
+        <w:rPr>
+          <w:lang w:val="ru-RU"/>
+        </w:rPr>
+        <w:t>– дихотомия в MBTI и соционике; ощущение связано с ориентацией на конкретные факты и детали, интуиция – на абстрактные связи, возможности и скрытые закономерности.</w:t>
+      </w:r>
+    </w:p>
+    <w:p>
+      <w:pPr>
+        <w:spacing w:after="0"/>
+        <w:ind w:firstLine="709"/>
+        <w:rPr>
+          <w:lang w:val="ru-RU"/>
+        </w:rPr>
+      </w:pPr>
       <w:r>
         <w:rPr>
           <w:b/>
           <w:bCs/>
           <w:lang w:val="ru-RU"/>
         </w:rPr>
-        <w:t>Briggs</w:t>
-      </w:r>
-      <w:proofErr w:type="spellEnd"/>
+        <w:t>Мышление / чувство (T/F)</w:t>
+      </w:r>
+      <w:r>
+        <w:rPr>
+          <w:lang w:val="ru-RU"/>
+        </w:rPr>
+        <w:t xml:space="preserve"> </w:t>
+      </w:r>
+      <w:r>
+        <w:rPr>
+          <w:lang w:val="ru-RU"/>
+        </w:rPr>
+        <w:t>– дихотомия, противопоставляющая логико-рациональный и ценностно-эмоциональный способы принятия решений и оценки информации.</w:t>
+      </w:r>
+    </w:p>
+    <w:p>
+      <w:pPr>
+        <w:spacing w:after="0"/>
+        <w:ind w:firstLine="709"/>
+        <w:rPr>
+          <w:lang w:val="ru-RU"/>
+        </w:rPr>
+      </w:pPr>
       <w:r>
         <w:rPr>
           <w:b/>
           <w:bCs/>
           <w:lang w:val="ru-RU"/>
         </w:rPr>
-        <w:t xml:space="preserve"> Type </w:t>
-      </w:r>
-      <w:proofErr w:type="spellStart"/>
+        <w:t>Суждение / восприятие (J/P)</w:t>
+      </w:r>
+      <w:r>
+        <w:rPr>
+          <w:lang w:val="ru-RU"/>
+        </w:rPr>
+        <w:t xml:space="preserve"> </w:t>
+      </w:r>
+      <w:r>
+        <w:rPr>
+          <w:lang w:val="ru-RU"/>
+        </w:rPr>
+        <w:t>– дихотомия MBTI, отражающая предпочтение структурированного, планирующего стиля (J) или более гибкого, спонтанного и открытого новому стиля (P).</w:t>
+      </w:r>
+    </w:p>
+    <w:p>
+      <w:pPr>
+        <w:spacing w:after="0"/>
+        <w:ind w:firstLine="709"/>
+        <w:rPr>
+          <w:lang w:val="ru-RU"/>
+        </w:rPr>
+      </w:pPr>
       <w:r>
         <w:rPr>
           <w:b/>
           <w:bCs/>
           <w:lang w:val="ru-RU"/>
         </w:rPr>
-        <w:t>Indicator</w:t>
-      </w:r>
-      <w:proofErr w:type="spellEnd"/>
+        <w:lastRenderedPageBreak/>
+        <w:t>Соционика</w:t>
+      </w:r>
+      <w:r>
+        <w:rPr>
+          <w:lang w:val="ru-RU"/>
+        </w:rPr>
+        <w:t xml:space="preserve"> </w:t>
+      </w:r>
+      <w:r>
+        <w:rPr>
+          <w:lang w:val="ru-RU"/>
+        </w:rPr>
+        <w:t>– типологический подход, развивший идеи Юнга в виде теории «типов информационного метаболизма», выделяющей 16 социотипов и описывающей их через восемь функций и систему межтипных отношений.</w:t>
+      </w:r>
+    </w:p>
+    <w:p>
+      <w:pPr>
+        <w:spacing w:after="0"/>
+        <w:ind w:firstLine="709"/>
+        <w:rPr>
+          <w:lang w:val="ru-RU"/>
+        </w:rPr>
+      </w:pPr>
       <w:r>
         <w:rPr>
           <w:b/>
           <w:bCs/>
           <w:lang w:val="ru-RU"/>
         </w:rPr>
-        <w:t>)</w:t>
+        <w:t>Информационный метаболизм</w:t>
       </w:r>
       <w:r>
         <w:rPr>
@@ -3084,21 +2715,7 @@
         <w:rPr>
           <w:lang w:val="ru-RU"/>
         </w:rPr>
-        <w:t xml:space="preserve">– опросник, основанный на </w:t>
-      </w:r>
-      <w:proofErr w:type="spellStart"/>
-      <w:r>
-        <w:rPr>
-          <w:lang w:val="ru-RU"/>
-        </w:rPr>
-        <w:t>юнгианской</w:t>
-      </w:r>
-      <w:proofErr w:type="spellEnd"/>
-      <w:r>
-        <w:rPr>
-          <w:lang w:val="ru-RU"/>
-        </w:rPr>
-        <w:t xml:space="preserve"> типологии, описывающий личность по четырём дихотомиям (E–I, S–N, T–F, J–P) и выделяющий 16 типов, например INTJ, ESFP.</w:t>
+        <w:t>– в соционике: метафорическое обозначение процессов приёма, переработки и выдачи информации человеком в зависимости от его типа; предполагается, что разные типы по-разному «обрабатывают» сходные стимулы.</w:t>
       </w:r>
     </w:p>
     <w:p>
@@ -3115,7 +2732,7 @@
           <w:bCs/>
           <w:lang w:val="ru-RU"/>
         </w:rPr>
-        <w:t>Экстраверсия / интроверсия (E/I)</w:t>
+        <w:t>Межтипные отношения</w:t>
       </w:r>
       <w:r>
         <w:rPr>
@@ -3127,7 +2744,7 @@
         <w:rPr>
           <w:lang w:val="ru-RU"/>
         </w:rPr>
-        <w:t>– дихотомия в MBTI и соционике, описывающая преимущественную направленность психической энергии на внешний мир людей и событий (экстраверсия) или на внутренний мир мыслей и переживаний (интроверсия).</w:t>
+        <w:t>– в соционике: описания типичных сценариев взаимодействия между различными социотипами (дуальность, конфликт, ревизия и др.), связываемые с совместимостью стилей информационного обмена.</w:t>
       </w:r>
     </w:p>
     <w:p>
@@ -3144,7 +2761,7 @@
           <w:bCs/>
           <w:lang w:val="ru-RU"/>
         </w:rPr>
-        <w:t>Ощущение / интуиция (S/N)</w:t>
+        <w:t>16PF (16 Personality Factors Questionnaire)</w:t>
       </w:r>
       <w:r>
         <w:rPr>
@@ -3156,7 +2773,7 @@
         <w:rPr>
           <w:lang w:val="ru-RU"/>
         </w:rPr>
-        <w:t>– дихотомия в MBTI и соционике; ощущение связано с ориентацией на конкретные факты и детали, интуиция – на абстрактные связи, возможности и скрытые закономерности.</w:t>
+        <w:t>– стандартизированный опросник Р. Кеттелла, измеряющий 16 первичных факторов личности и несколько глобальных факторов на непрерывных шкалах; широко применяется в научных и прикладных исследованиях.</w:t>
       </w:r>
     </w:p>
     <w:p>
@@ -3173,7 +2790,7 @@
           <w:bCs/>
           <w:lang w:val="ru-RU"/>
         </w:rPr>
-        <w:t>Мышление / чувство (T/F)</w:t>
+        <w:t>Первичные факторы 16PF</w:t>
       </w:r>
       <w:r>
         <w:rPr>
@@ -3185,7 +2802,7 @@
         <w:rPr>
           <w:lang w:val="ru-RU"/>
         </w:rPr>
-        <w:t>– дихотомия, противопоставляющая логико-рациональный и ценностно-эмоциональный способы принятия решений и оценки информации.</w:t>
+        <w:t>– базовые личностные шкалы опросника Кеттелла (теплота, рассудочность, эмоциональная устойчивость, доминантность, живость, сознательность в соблюдении правил, социальная смелость, чувствительность, настороженность, абстрактность, закрытость, тревожность, открытость к изменениям, самодостаточность, перфекционизм, напряжённость).</w:t>
       </w:r>
     </w:p>
     <w:p>
@@ -3202,7 +2819,7 @@
           <w:bCs/>
           <w:lang w:val="ru-RU"/>
         </w:rPr>
-        <w:t>Суждение / восприятие (J/P)</w:t>
+        <w:t>Личностная черта (trait)</w:t>
       </w:r>
       <w:r>
         <w:rPr>
@@ -3214,7 +2831,7 @@
         <w:rPr>
           <w:lang w:val="ru-RU"/>
         </w:rPr>
-        <w:t>– дихотомия MBTI, отражающая предпочтение структурированного, планирующего стиля (J) или более гибкого, спонтанного и открытого новому стиля (P).</w:t>
+        <w:t>– относительно устойчивая характеристика личности, выраженная в разной степени у разных людей и измеряемая по континуальной шкале, в отличие от жёсткого отнесения к типу.</w:t>
       </w:r>
     </w:p>
     <w:p>
@@ -3232,7 +2849,7 @@
           <w:lang w:val="ru-RU"/>
         </w:rPr>
         <w:lastRenderedPageBreak/>
-        <w:t>Соционика</w:t>
+        <w:t>Валидность теста</w:t>
       </w:r>
       <w:r>
         <w:rPr>
@@ -3244,21 +2861,7 @@
         <w:rPr>
           <w:lang w:val="ru-RU"/>
         </w:rPr>
-        <w:t xml:space="preserve">– типологический подход, развивший идеи Юнга в виде теории «типов информационного метаболизма», выделяющей 16 социотипов и описывающей их через восемь функций и систему </w:t>
-      </w:r>
-      <w:proofErr w:type="spellStart"/>
-      <w:r>
-        <w:rPr>
-          <w:lang w:val="ru-RU"/>
-        </w:rPr>
-        <w:t>межтипных</w:t>
-      </w:r>
-      <w:proofErr w:type="spellEnd"/>
-      <w:r>
-        <w:rPr>
-          <w:lang w:val="ru-RU"/>
-        </w:rPr>
-        <w:t xml:space="preserve"> отношений.</w:t>
+        <w:t>– степень, в которой психодиагностическая методика действительно измеряет заявляемый психологический конструкт (например, черты личности), а её результаты связаны с внешними критериями.</w:t>
       </w:r>
     </w:p>
     <w:p>
@@ -3275,7 +2878,7 @@
           <w:bCs/>
           <w:lang w:val="ru-RU"/>
         </w:rPr>
-        <w:t>Информационный метаболизм</w:t>
+        <w:t>Надёжность теста</w:t>
       </w:r>
       <w:r>
         <w:rPr>
@@ -3287,320 +2890,7 @@
         <w:rPr>
           <w:lang w:val="ru-RU"/>
         </w:rPr>
-        <w:t>– в соционике: метафорическое обозначение процессов приёма, переработки и выдачи информации человеком в зависимости от его типа; предполагается, что разные типы по-разному «обрабатывают» сходные стимулы.</w:t>
-      </w:r>
-    </w:p>
-    <w:p>
-      <w:pPr>
-        <w:spacing w:after="0"/>
-        <w:ind w:firstLine="709"/>
-        <w:rPr>
-          <w:lang w:val="ru-RU"/>
-        </w:rPr>
-      </w:pPr>
-      <w:proofErr w:type="spellStart"/>
-      <w:r>
-        <w:rPr>
-          <w:b/>
-          <w:bCs/>
-          <w:lang w:val="ru-RU"/>
-        </w:rPr>
-        <w:t>Межтипные</w:t>
-      </w:r>
-      <w:proofErr w:type="spellEnd"/>
-      <w:r>
-        <w:rPr>
-          <w:b/>
-          <w:bCs/>
-          <w:lang w:val="ru-RU"/>
-        </w:rPr>
-        <w:t xml:space="preserve"> отношения</w:t>
-      </w:r>
-      <w:r>
-        <w:rPr>
-          <w:lang w:val="ru-RU"/>
-        </w:rPr>
-        <w:t xml:space="preserve"> </w:t>
-      </w:r>
-      <w:r>
-        <w:rPr>
-          <w:lang w:val="ru-RU"/>
-        </w:rPr>
-        <w:t>– в соционике: описания типичных сценариев взаимодействия между различными социотипами (</w:t>
-      </w:r>
-      <w:proofErr w:type="spellStart"/>
-      <w:r>
-        <w:rPr>
-          <w:lang w:val="ru-RU"/>
-        </w:rPr>
-        <w:t>дуальность</w:t>
-      </w:r>
-      <w:proofErr w:type="spellEnd"/>
-      <w:r>
-        <w:rPr>
-          <w:lang w:val="ru-RU"/>
-        </w:rPr>
-        <w:t>, конфликт, ревизия и др.), связываемые с совместимостью стилей информационного обмена.</w:t>
-      </w:r>
-    </w:p>
-    <w:p>
-      <w:pPr>
-        <w:spacing w:after="0"/>
-        <w:ind w:firstLine="709"/>
-        <w:rPr>
-          <w:lang w:val="ru-RU"/>
-        </w:rPr>
-      </w:pPr>
-      <w:r>
-        <w:rPr>
-          <w:b/>
-          <w:bCs/>
-          <w:lang w:val="ru-RU"/>
-        </w:rPr>
-        <w:t xml:space="preserve">16PF (16 </w:t>
-      </w:r>
-      <w:proofErr w:type="spellStart"/>
-      <w:r>
-        <w:rPr>
-          <w:b/>
-          <w:bCs/>
-          <w:lang w:val="ru-RU"/>
-        </w:rPr>
-        <w:t>Personality</w:t>
-      </w:r>
-      <w:proofErr w:type="spellEnd"/>
-      <w:r>
-        <w:rPr>
-          <w:b/>
-          <w:bCs/>
-          <w:lang w:val="ru-RU"/>
-        </w:rPr>
-        <w:t xml:space="preserve"> </w:t>
-      </w:r>
-      <w:proofErr w:type="spellStart"/>
-      <w:r>
-        <w:rPr>
-          <w:b/>
-          <w:bCs/>
-          <w:lang w:val="ru-RU"/>
-        </w:rPr>
-        <w:t>Factors</w:t>
-      </w:r>
-      <w:proofErr w:type="spellEnd"/>
-      <w:r>
-        <w:rPr>
-          <w:b/>
-          <w:bCs/>
-          <w:lang w:val="ru-RU"/>
-        </w:rPr>
-        <w:t xml:space="preserve"> </w:t>
-      </w:r>
-      <w:proofErr w:type="spellStart"/>
-      <w:r>
-        <w:rPr>
-          <w:b/>
-          <w:bCs/>
-          <w:lang w:val="ru-RU"/>
-        </w:rPr>
-        <w:t>Questionnaire</w:t>
-      </w:r>
-      <w:proofErr w:type="spellEnd"/>
-      <w:r>
-        <w:rPr>
-          <w:b/>
-          <w:bCs/>
-          <w:lang w:val="ru-RU"/>
-        </w:rPr>
-        <w:t>)</w:t>
-      </w:r>
-      <w:r>
-        <w:rPr>
-          <w:lang w:val="ru-RU"/>
-        </w:rPr>
-        <w:t xml:space="preserve"> </w:t>
-      </w:r>
-      <w:r>
-        <w:rPr>
-          <w:lang w:val="ru-RU"/>
-        </w:rPr>
-        <w:t xml:space="preserve">– стандартизированный опросник Р. </w:t>
-      </w:r>
-      <w:proofErr w:type="spellStart"/>
-      <w:r>
-        <w:rPr>
-          <w:lang w:val="ru-RU"/>
-        </w:rPr>
-        <w:t>Кеттелла</w:t>
-      </w:r>
-      <w:proofErr w:type="spellEnd"/>
-      <w:r>
-        <w:rPr>
-          <w:lang w:val="ru-RU"/>
-        </w:rPr>
-        <w:t>, измеряющий 16 первичных факторов личности и несколько глобальных факторов на непрерывных шкалах; широко применяется в научных и прикладных исследованиях.</w:t>
-      </w:r>
-    </w:p>
-    <w:p>
-      <w:pPr>
-        <w:spacing w:after="0"/>
-        <w:ind w:firstLine="709"/>
-        <w:rPr>
-          <w:lang w:val="ru-RU"/>
-        </w:rPr>
-      </w:pPr>
-      <w:r>
-        <w:rPr>
-          <w:b/>
-          <w:bCs/>
-          <w:lang w:val="ru-RU"/>
-        </w:rPr>
-        <w:t>Первичные факторы 16PF</w:t>
-      </w:r>
-      <w:r>
-        <w:rPr>
-          <w:lang w:val="ru-RU"/>
-        </w:rPr>
-        <w:t xml:space="preserve"> </w:t>
-      </w:r>
-      <w:r>
-        <w:rPr>
-          <w:lang w:val="ru-RU"/>
-        </w:rPr>
-        <w:t xml:space="preserve">– базовые личностные шкалы опросника </w:t>
-      </w:r>
-      <w:proofErr w:type="spellStart"/>
-      <w:r>
-        <w:rPr>
-          <w:lang w:val="ru-RU"/>
-        </w:rPr>
-        <w:t>Кеттелла</w:t>
-      </w:r>
-      <w:proofErr w:type="spellEnd"/>
-      <w:r>
-        <w:rPr>
-          <w:lang w:val="ru-RU"/>
-        </w:rPr>
-        <w:t xml:space="preserve"> (теплота, рассудочность, эмоциональная устойчивость, доминантность, живость, сознательность в соблюдении правил, социальная смелость, чувствительность, настороженность, абстрактность, закрытость, тревожность, открытость к изменениям, самодостаточность, перфекционизм, напряжённость).</w:t>
-      </w:r>
-    </w:p>
-    <w:p>
-      <w:pPr>
-        <w:spacing w:after="0"/>
-        <w:ind w:firstLine="709"/>
-        <w:rPr>
-          <w:lang w:val="ru-RU"/>
-        </w:rPr>
-      </w:pPr>
-      <w:r>
-        <w:rPr>
-          <w:b/>
-          <w:bCs/>
-          <w:lang w:val="ru-RU"/>
-        </w:rPr>
-        <w:t>Личностная черта (</w:t>
-      </w:r>
-      <w:proofErr w:type="spellStart"/>
-      <w:r>
-        <w:rPr>
-          <w:b/>
-          <w:bCs/>
-          <w:lang w:val="ru-RU"/>
-        </w:rPr>
-        <w:t>trait</w:t>
-      </w:r>
-      <w:proofErr w:type="spellEnd"/>
-      <w:r>
-        <w:rPr>
-          <w:b/>
-          <w:bCs/>
-          <w:lang w:val="ru-RU"/>
-        </w:rPr>
-        <w:t>)</w:t>
-      </w:r>
-      <w:r>
-        <w:rPr>
-          <w:lang w:val="ru-RU"/>
-        </w:rPr>
-        <w:t xml:space="preserve"> </w:t>
-      </w:r>
-      <w:r>
-        <w:rPr>
-          <w:lang w:val="ru-RU"/>
-        </w:rPr>
-        <w:t>– относительно устойчивая характеристика личности, выраженная в разной степени у разных людей и измеряемая по континуальной шкале, в отличие от жёсткого отнесения к типу.</w:t>
-      </w:r>
-    </w:p>
-    <w:p>
-      <w:pPr>
-        <w:spacing w:after="0"/>
-        <w:ind w:firstLine="709"/>
-        <w:rPr>
-          <w:lang w:val="ru-RU"/>
-        </w:rPr>
-      </w:pPr>
-      <w:r>
-        <w:rPr>
-          <w:b/>
-          <w:bCs/>
-          <w:lang w:val="ru-RU"/>
-        </w:rPr>
-        <w:lastRenderedPageBreak/>
-        <w:t>Валидность теста</w:t>
-      </w:r>
-      <w:r>
-        <w:rPr>
-          <w:lang w:val="ru-RU"/>
-        </w:rPr>
-        <w:t xml:space="preserve"> </w:t>
-      </w:r>
-      <w:r>
-        <w:rPr>
-          <w:lang w:val="ru-RU"/>
-        </w:rPr>
-        <w:t>– степень, в которой психодиагностическая методика действительно измеряет заявляемый психологический конструкт (например, черты личности), а её результаты связаны с внешними критериями.</w:t>
-      </w:r>
-    </w:p>
-    <w:p>
-      <w:pPr>
-        <w:spacing w:after="0"/>
-        <w:ind w:firstLine="709"/>
-        <w:rPr>
-          <w:lang w:val="ru-RU"/>
-        </w:rPr>
-      </w:pPr>
-      <w:r>
-        <w:rPr>
-          <w:b/>
-          <w:bCs/>
-          <w:lang w:val="ru-RU"/>
-        </w:rPr>
-        <w:t>Надёжность теста</w:t>
-      </w:r>
-      <w:r>
-        <w:rPr>
-          <w:lang w:val="ru-RU"/>
-        </w:rPr>
-        <w:t xml:space="preserve"> </w:t>
-      </w:r>
-      <w:r>
-        <w:rPr>
-          <w:lang w:val="ru-RU"/>
-        </w:rPr>
-        <w:t>– показатель устойчивости и согласованности результатов психодиагностической методики при повторных измерениях (тест–</w:t>
-      </w:r>
-      <w:proofErr w:type="spellStart"/>
-      <w:r>
-        <w:rPr>
-          <w:lang w:val="ru-RU"/>
-        </w:rPr>
-        <w:t>ретест</w:t>
-      </w:r>
-      <w:proofErr w:type="spellEnd"/>
-      <w:r>
-        <w:rPr>
-          <w:lang w:val="ru-RU"/>
-        </w:rPr>
-        <w:t>), между частями опросника или разными оценщиками.</w:t>
+        <w:t>– показатель устойчивости и согласованности результатов психодиагностической методики при повторных измерениях (тест–ретест), между частями опросника или разными оценщиками.</w:t>
       </w:r>
     </w:p>
     <w:p>
@@ -3795,23 +3085,13 @@
           <w:lang w:val="ru-RU"/>
         </w:rPr>
       </w:pPr>
-      <w:proofErr w:type="spellStart"/>
       <w:r>
         <w:rPr>
           <w:b/>
           <w:bCs/>
           <w:lang w:val="ru-RU"/>
         </w:rPr>
-        <w:t>Сенсорик</w:t>
-      </w:r>
-      <w:proofErr w:type="spellEnd"/>
-      <w:r>
-        <w:rPr>
-          <w:b/>
-          <w:bCs/>
-          <w:lang w:val="ru-RU"/>
-        </w:rPr>
-        <w:t xml:space="preserve"> (S)</w:t>
+        <w:t>Сенсорик (S)</w:t>
       </w:r>
       <w:r>
         <w:rPr>
@@ -3838,23 +3118,13 @@
           <w:lang w:val="ru-RU"/>
         </w:rPr>
       </w:pPr>
-      <w:proofErr w:type="spellStart"/>
       <w:r>
         <w:rPr>
           <w:b/>
           <w:bCs/>
           <w:lang w:val="ru-RU"/>
         </w:rPr>
-        <w:t>Интуит</w:t>
-      </w:r>
-      <w:proofErr w:type="spellEnd"/>
-      <w:r>
-        <w:rPr>
-          <w:b/>
-          <w:bCs/>
-          <w:lang w:val="ru-RU"/>
-        </w:rPr>
-        <w:t xml:space="preserve"> (N)</w:t>
+        <w:t>Интуит (N)</w:t>
       </w:r>
       <w:r>
         <w:rPr>
@@ -4008,41 +3278,13 @@
           <w:lang w:val="ru-RU"/>
         </w:rPr>
       </w:pPr>
-      <w:proofErr w:type="spellStart"/>
       <w:r>
         <w:rPr>
           <w:b/>
           <w:bCs/>
           <w:lang w:val="ru-RU"/>
         </w:rPr>
-        <w:t>Рационал</w:t>
-      </w:r>
-      <w:proofErr w:type="spellEnd"/>
-      <w:r>
-        <w:rPr>
-          <w:b/>
-          <w:bCs/>
-          <w:lang w:val="ru-RU"/>
-        </w:rPr>
-        <w:t xml:space="preserve"> (J, </w:t>
-      </w:r>
-      <w:proofErr w:type="spellStart"/>
-      <w:r>
-        <w:rPr>
-          <w:b/>
-          <w:bCs/>
-          <w:lang w:val="ru-RU"/>
-        </w:rPr>
-        <w:t>Judging</w:t>
-      </w:r>
-      <w:proofErr w:type="spellEnd"/>
-      <w:r>
-        <w:rPr>
-          <w:b/>
-          <w:bCs/>
-          <w:lang w:val="ru-RU"/>
-        </w:rPr>
-        <w:t>)</w:t>
+        <w:t>Рационал (J, Judging)</w:t>
       </w:r>
       <w:r>
         <w:rPr>
@@ -4069,41 +3311,297 @@
           <w:lang w:val="ru-RU"/>
         </w:rPr>
       </w:pPr>
-      <w:proofErr w:type="spellStart"/>
       <w:r>
         <w:rPr>
           <w:b/>
           <w:bCs/>
           <w:lang w:val="ru-RU"/>
         </w:rPr>
-        <w:t>Иррационал</w:t>
-      </w:r>
-      <w:proofErr w:type="spellEnd"/>
+        <w:t>Иррационал (P, Perceiving)</w:t>
+      </w:r>
+      <w:r>
+        <w:rPr>
+          <w:lang w:val="ru-RU"/>
+        </w:rPr>
+        <w:t xml:space="preserve"> </w:t>
+      </w:r>
+      <w:r>
+        <w:rPr>
+          <w:lang w:val="ru-RU"/>
+        </w:rPr>
+        <w:t>ценит гибкость и открытость новым возможностям. Предпочитает оставлять варианты открытыми, адаптироваться по ситуации, менять планы по ходу, легче чувствует себя в условиях неопределённости и спонтанности.</w:t>
+      </w:r>
+    </w:p>
+    <w:p>
+      <w:pPr>
+        <w:spacing w:after="0"/>
+        <w:ind w:firstLine="709"/>
+        <w:rPr>
+          <w:lang w:val="ru-RU"/>
+        </w:rPr>
+      </w:pPr>
       <w:r>
         <w:rPr>
           <w:b/>
           <w:bCs/>
           <w:lang w:val="ru-RU"/>
         </w:rPr>
-        <w:t xml:space="preserve"> (P, </w:t>
-      </w:r>
-      <w:proofErr w:type="spellStart"/>
+        <w:lastRenderedPageBreak/>
+        <w:t xml:space="preserve">Комбинация четырёх предпочтений даёт 16 базовых психотипов (например, INTP, ESFJ), где каждая буква описывает характерный стиль: </w:t>
+      </w:r>
+      <w:r>
+        <w:rPr>
+          <w:lang w:val="ru-RU"/>
+        </w:rPr>
+        <w:t>источник энергии (E/I), способ восприятия (S/N), стиль решения (T/F) и образ жизни (J/P).</w:t>
+      </w:r>
+    </w:p>
+    <w:p>
+      <w:pPr>
+        <w:spacing w:line="278" w:lineRule="auto"/>
+        <w:jc w:val="left"/>
+        <w:rPr>
+          <w:lang w:val="ru-RU"/>
+        </w:rPr>
+      </w:pPr>
+      <w:r>
+        <w:rPr>
+          <w:lang w:val="ru-RU"/>
+        </w:rPr>
+        <w:br w:type="page"/>
+      </w:r>
+    </w:p>
+    <w:p>
+      <w:pPr>
+        <w:pStyle w:val="1"/>
+        <w:rPr>
+          <w:lang w:val="ru-RU"/>
+        </w:rPr>
+      </w:pPr>
+      <w:r>
+        <w:rPr>
+          <w:lang w:val="ru-RU"/>
+        </w:rPr>
+        <w:lastRenderedPageBreak/>
+        <w:t>ВВЕДЕНИЕ</w:t>
+      </w:r>
+      <w:bookmarkEnd w:id="4"/>
+    </w:p>
+    <w:p>
+      <w:pPr>
+        <w:spacing w:after="0"/>
+        <w:ind w:firstLine="709"/>
+        <w:rPr>
+          <w:lang w:val="ru-RU"/>
+        </w:rPr>
+      </w:pPr>
+      <w:bookmarkStart w:id="5" w:name="_Toc1"/>
+      <w:bookmarkStart w:id="6" w:name="_Toc216465008"/>
+    </w:p>
+    <w:p>
+      <w:pPr>
+        <w:spacing w:after="0"/>
+        <w:ind w:firstLine="709"/>
+        <w:rPr>
+          <w:lang w:val="ru-RU"/>
+        </w:rPr>
+      </w:pPr>
+      <w:r>
+        <w:rPr>
+          <w:lang w:val="ru-RU"/>
+        </w:rPr>
+        <w:t>Современная дифференциальная психология располагает большим числом моделей и опросников, предназначенных для описания индивидуальных различий личности, однако в широкой практике нередко используются методики с разным уровнем научной обоснованности.</w:t>
+      </w:r>
+    </w:p>
+    <w:p>
+      <w:pPr>
+        <w:spacing w:after="0"/>
+        <w:ind w:firstLine="709"/>
+        <w:rPr>
+          <w:lang w:val="ru-RU"/>
+        </w:rPr>
+      </w:pPr>
+    </w:p>
+    <w:p>
+      <w:pPr>
+        <w:spacing w:after="0"/>
+        <w:ind w:firstLine="709"/>
+        <w:rPr>
+          <w:lang w:val="ru-RU"/>
+        </w:rPr>
+      </w:pPr>
+      <w:r>
+        <w:rPr>
+          <w:lang w:val="ru-RU"/>
+        </w:rPr>
+        <w:t>Типология Майерс–Бриггс (MBTI) и соционика широко распространены в популярной и корпоративной психологии, в то время как 16-факторный опросник личности Р. Кеттелла (16PF) относится к числу профессиональных психодиагностических инструментов.</w:t>
+      </w:r>
+    </w:p>
+    <w:p>
+      <w:pPr>
+        <w:spacing w:after="0"/>
+        <w:ind w:firstLine="709"/>
+        <w:rPr>
+          <w:lang w:val="ru-RU"/>
+        </w:rPr>
+      </w:pPr>
+    </w:p>
+    <w:p>
+      <w:pPr>
+        <w:spacing w:after="0"/>
+        <w:ind w:firstLine="709"/>
+        <w:rPr>
+          <w:lang w:val="ru-RU"/>
+        </w:rPr>
+      </w:pPr>
+      <w:r>
+        <w:rPr>
+          <w:lang w:val="ru-RU"/>
+        </w:rPr>
+        <w:t>Исторически и MBTI, и соционика восходят к юнгианской теории психологических типов, фокусируясь на качественных различиях между людьми и описывая их через ограниченное число типологических категорий.</w:t>
+      </w:r>
+    </w:p>
+    <w:p>
+      <w:pPr>
+        <w:spacing w:after="0"/>
+        <w:ind w:firstLine="709"/>
+        <w:rPr>
+          <w:lang w:val="ru-RU"/>
+        </w:rPr>
+      </w:pPr>
+    </w:p>
+    <w:p>
+      <w:pPr>
+        <w:spacing w:after="0"/>
+        <w:ind w:firstLine="709"/>
+        <w:rPr>
+          <w:lang w:val="ru-RU"/>
+        </w:rPr>
+      </w:pPr>
+      <w:r>
+        <w:rPr>
+          <w:lang w:val="ru-RU"/>
+        </w:rPr>
+        <w:t>Напротив, 16PF опирается на факторно-аналитическую традицию исследования личности и предъявляет непрерывные шкалы, отражающие степень выраженности ряда относительно независимых черт, что сближает его с современными научными моделями личностной структуры.</w:t>
+      </w:r>
+    </w:p>
+    <w:p>
+      <w:pPr>
+        <w:spacing w:after="0"/>
+        <w:ind w:firstLine="709"/>
+        <w:rPr>
+          <w:lang w:val="ru-RU"/>
+        </w:rPr>
+      </w:pPr>
+    </w:p>
+    <w:p>
+      <w:pPr>
+        <w:spacing w:after="0"/>
+        <w:ind w:firstLine="709"/>
+        <w:rPr>
+          <w:lang w:val="ru-RU"/>
+        </w:rPr>
+      </w:pPr>
+      <w:r>
+        <w:rPr>
+          <w:lang w:val="ru-RU"/>
+        </w:rPr>
+        <w:t xml:space="preserve">При этом популярность типологических моделей среди практиков и неспециалистов нередко сочетается с критикой со стороны </w:t>
+      </w:r>
+      <w:r>
+        <w:rPr>
+          <w:lang w:val="ru-RU"/>
+        </w:rPr>
+        <w:lastRenderedPageBreak/>
+        <w:t>исследователей, указывающих на проблемы валидности, надежности и избыточной упрощенности таких подходов.</w:t>
+      </w:r>
+    </w:p>
+    <w:p>
+      <w:pPr>
+        <w:spacing w:after="0"/>
+        <w:ind w:firstLine="709"/>
+        <w:rPr>
+          <w:lang w:val="ru-RU"/>
+        </w:rPr>
+      </w:pPr>
+    </w:p>
+    <w:p>
+      <w:pPr>
+        <w:spacing w:after="0"/>
+        <w:ind w:firstLine="709"/>
+        <w:rPr>
+          <w:lang w:val="ru-RU"/>
+        </w:rPr>
+      </w:pPr>
+      <w:r>
+        <w:rPr>
+          <w:lang w:val="ru-RU"/>
+        </w:rPr>
+        <w:t>Возникает противоречие между востребованностью простых типологий в обучении, HR и саморазвитии, с одной стороны, и требованиями научной психометрии к строгим диагностическим методам — с другой.</w:t>
+      </w:r>
+    </w:p>
+    <w:p>
+      <w:pPr>
+        <w:spacing w:after="0"/>
+        <w:ind w:firstLine="709"/>
+        <w:rPr>
+          <w:lang w:val="ru-RU"/>
+        </w:rPr>
+      </w:pPr>
+    </w:p>
+    <w:p>
+      <w:pPr>
+        <w:spacing w:after="0"/>
+        <w:ind w:firstLine="709"/>
+        <w:rPr>
+          <w:lang w:val="ru-RU"/>
+        </w:rPr>
+      </w:pPr>
       <w:r>
         <w:rPr>
           <w:b/>
           <w:bCs/>
           <w:lang w:val="ru-RU"/>
         </w:rPr>
-        <w:t>Perceiving</w:t>
-      </w:r>
-      <w:proofErr w:type="spellEnd"/>
+        <w:t>Цель настоящей работы</w:t>
+      </w:r>
+      <w:r>
+        <w:rPr>
+          <w:lang w:val="ru-RU"/>
+        </w:rPr>
+        <w:t xml:space="preserve"> — выполнить сравнительный анализ типологий личности MBTI и соционики и 16-факторного опросника Кеттелла с точки зрения их теоретических оснований, структуры шкал и области допустимого применения.</w:t>
+      </w:r>
+    </w:p>
+    <w:p>
+      <w:pPr>
+        <w:spacing w:after="0"/>
+        <w:ind w:firstLine="709"/>
+        <w:rPr>
+          <w:lang w:val="ru-RU"/>
+        </w:rPr>
+      </w:pPr>
+    </w:p>
+    <w:p>
+      <w:pPr>
+        <w:spacing w:after="0"/>
+        <w:ind w:firstLine="709"/>
+        <w:rPr>
+          <w:lang w:val="ru-RU"/>
+        </w:rPr>
+      </w:pPr>
       <w:r>
         <w:rPr>
           <w:b/>
           <w:bCs/>
           <w:lang w:val="ru-RU"/>
         </w:rPr>
-        <w:t>)</w:t>
+        <w:t>В рамках этой цели предполагается:</w:t>
+      </w:r>
+      <w:r>
+        <w:rPr>
+          <w:lang w:val="ru-RU"/>
+        </w:rPr>
+        <w:t xml:space="preserve"> проследить генезис указанных моделей, рассмотреть особенности измеряемых конструктов и форматов интерпретации результатов, а также обобщить данные о психометрических свойствах методик и типичных сферах их использования в психологической и около</w:t>
       </w:r>
       <w:r>
         <w:rPr>
@@ -4115,275 +3613,18 @@
         <w:rPr>
           <w:lang w:val="ru-RU"/>
         </w:rPr>
-        <w:t>ценит гибкость и открытость новым возможностям. Предпочитает оставлять варианты открытыми, адаптироваться по ситуации, менять планы по ходу, легче чувствует себя в условиях неопределённости и спонтанности.</w:t>
-      </w:r>
-    </w:p>
-    <w:p>
-      <w:pPr>
-        <w:spacing w:after="0"/>
-        <w:ind w:firstLine="709"/>
-        <w:rPr>
-          <w:lang w:val="ru-RU"/>
-        </w:rPr>
-      </w:pPr>
-      <w:r>
+        <w:t>психологической практике.</w:t>
+      </w:r>
+    </w:p>
+    <w:p>
+      <w:pPr>
+        <w:spacing w:line="278" w:lineRule="auto"/>
+        <w:jc w:val="left"/>
         <w:rPr>
           <w:b/>
           <w:bCs/>
           <w:lang w:val="ru-RU"/>
         </w:rPr>
-        <w:lastRenderedPageBreak/>
-        <w:t xml:space="preserve">Комбинация четырёх предпочтений даёт 16 базовых психотипов (например, INTP, ESFJ), где каждая буква описывает характерный стиль: </w:t>
-      </w:r>
-      <w:r>
-        <w:rPr>
-          <w:lang w:val="ru-RU"/>
-        </w:rPr>
-        <w:t>источник энергии (E/I), способ восприятия (S/N), стиль решения (T/F) и образ жизни (J/P).</w:t>
-      </w:r>
-    </w:p>
-    <w:p>
-      <w:pPr>
-        <w:spacing w:line="278" w:lineRule="auto"/>
-        <w:jc w:val="left"/>
-        <w:rPr>
-          <w:lang w:val="ru-RU"/>
-        </w:rPr>
-      </w:pPr>
-      <w:r>
-        <w:rPr>
-          <w:lang w:val="ru-RU"/>
-        </w:rPr>
-        <w:br w:type="page"/>
-      </w:r>
-    </w:p>
-    <w:p>
-      <w:pPr>
-        <w:pStyle w:val="1"/>
-        <w:rPr>
-          <w:lang w:val="ru-RU"/>
-        </w:rPr>
-      </w:pPr>
-      <w:r>
-        <w:rPr>
-          <w:lang w:val="ru-RU"/>
-        </w:rPr>
-        <w:lastRenderedPageBreak/>
-        <w:t>ВВЕДЕНИЕ</w:t>
-      </w:r>
-      <w:bookmarkEnd w:id="4"/>
-    </w:p>
-    <w:p>
-      <w:pPr>
-        <w:spacing w:after="0"/>
-        <w:ind w:firstLine="709"/>
-        <w:rPr>
-          <w:lang w:val="ru-RU"/>
-        </w:rPr>
-      </w:pPr>
-      <w:bookmarkStart w:id="5" w:name="_Toc1"/>
-      <w:bookmarkStart w:id="6" w:name="_Toc216465008"/>
-    </w:p>
-    <w:p>
-      <w:pPr>
-        <w:spacing w:after="0"/>
-        <w:ind w:firstLine="709"/>
-        <w:rPr>
-          <w:lang w:val="ru-RU"/>
-        </w:rPr>
-      </w:pPr>
-      <w:r>
-        <w:rPr>
-          <w:lang w:val="ru-RU"/>
-        </w:rPr>
-        <w:t>Современная дифференциальная психология располагает большим числом моделей и опросников, предназначенных для описания индивидуальных различий личности, однако в широкой практике нередко используются методики с разным уровнем научной обоснованности.</w:t>
-      </w:r>
-    </w:p>
-    <w:p>
-      <w:pPr>
-        <w:spacing w:after="0"/>
-        <w:ind w:firstLine="709"/>
-        <w:rPr>
-          <w:lang w:val="ru-RU"/>
-        </w:rPr>
-      </w:pPr>
-    </w:p>
-    <w:p>
-      <w:pPr>
-        <w:spacing w:after="0"/>
-        <w:ind w:firstLine="709"/>
-        <w:rPr>
-          <w:lang w:val="ru-RU"/>
-        </w:rPr>
-      </w:pPr>
-      <w:r>
-        <w:rPr>
-          <w:lang w:val="ru-RU"/>
-        </w:rPr>
-        <w:t xml:space="preserve">Типология Майерс–Бриггс (MBTI) и соционика широко распространены в популярной и корпоративной психологии, в то время как 16-факторный опросник личности Р. </w:t>
-      </w:r>
-      <w:proofErr w:type="spellStart"/>
-      <w:r>
-        <w:rPr>
-          <w:lang w:val="ru-RU"/>
-        </w:rPr>
-        <w:t>Кеттелла</w:t>
-      </w:r>
-      <w:proofErr w:type="spellEnd"/>
-      <w:r>
-        <w:rPr>
-          <w:lang w:val="ru-RU"/>
-        </w:rPr>
-        <w:t xml:space="preserve"> (16PF) относится к числу профессиональных психодиагностических инструментов.</w:t>
-      </w:r>
-    </w:p>
-    <w:p>
-      <w:pPr>
-        <w:spacing w:after="0"/>
-        <w:ind w:firstLine="709"/>
-        <w:rPr>
-          <w:lang w:val="ru-RU"/>
-        </w:rPr>
-      </w:pPr>
-    </w:p>
-    <w:p>
-      <w:pPr>
-        <w:spacing w:after="0"/>
-        <w:ind w:firstLine="709"/>
-        <w:rPr>
-          <w:lang w:val="ru-RU"/>
-        </w:rPr>
-      </w:pPr>
-      <w:r>
-        <w:rPr>
-          <w:lang w:val="ru-RU"/>
-        </w:rPr>
-        <w:t xml:space="preserve">Исторически и MBTI, и соционика восходят к </w:t>
-      </w:r>
-      <w:proofErr w:type="spellStart"/>
-      <w:r>
-        <w:rPr>
-          <w:lang w:val="ru-RU"/>
-        </w:rPr>
-        <w:t>юнгианской</w:t>
-      </w:r>
-      <w:proofErr w:type="spellEnd"/>
-      <w:r>
-        <w:rPr>
-          <w:lang w:val="ru-RU"/>
-        </w:rPr>
-        <w:t xml:space="preserve"> теории психологических типов, фокусируясь на качественных различиях между людьми и описывая их через ограниченное число типологических категорий.</w:t>
-      </w:r>
-    </w:p>
-    <w:p>
-      <w:pPr>
-        <w:spacing w:after="0"/>
-        <w:ind w:firstLine="709"/>
-        <w:rPr>
-          <w:lang w:val="ru-RU"/>
-        </w:rPr>
-      </w:pPr>
-    </w:p>
-    <w:p>
-      <w:pPr>
-        <w:spacing w:after="0"/>
-        <w:ind w:firstLine="709"/>
-        <w:rPr>
-          <w:lang w:val="ru-RU"/>
-        </w:rPr>
-      </w:pPr>
-      <w:r>
-        <w:rPr>
-          <w:lang w:val="ru-RU"/>
-        </w:rPr>
-        <w:t xml:space="preserve">Напротив, 16PF опирается на </w:t>
-      </w:r>
-      <w:proofErr w:type="spellStart"/>
-      <w:r>
-        <w:rPr>
-          <w:lang w:val="ru-RU"/>
-        </w:rPr>
-        <w:t>факторно</w:t>
-      </w:r>
-      <w:proofErr w:type="spellEnd"/>
-      <w:r>
-        <w:rPr>
-          <w:lang w:val="ru-RU"/>
-        </w:rPr>
-        <w:t>-аналитическую традицию исследования личности и предъявляет непрерывные шкалы, отражающие степень выраженности ряда относительно независимых черт, что сближает его с современными научными моделями личностной структуры.</w:t>
-      </w:r>
-    </w:p>
-    <w:p>
-      <w:pPr>
-        <w:spacing w:after="0"/>
-        <w:ind w:firstLine="709"/>
-        <w:rPr>
-          <w:lang w:val="ru-RU"/>
-        </w:rPr>
-      </w:pPr>
-    </w:p>
-    <w:p>
-      <w:pPr>
-        <w:spacing w:after="0"/>
-        <w:ind w:firstLine="709"/>
-        <w:rPr>
-          <w:lang w:val="ru-RU"/>
-        </w:rPr>
-      </w:pPr>
-      <w:r>
-        <w:rPr>
-          <w:lang w:val="ru-RU"/>
-        </w:rPr>
-        <w:t xml:space="preserve">При этом популярность типологических моделей среди практиков и неспециалистов нередко сочетается с критикой со стороны </w:t>
-      </w:r>
-      <w:r>
-        <w:rPr>
-          <w:lang w:val="ru-RU"/>
-        </w:rPr>
-        <w:lastRenderedPageBreak/>
-        <w:t>исследователей, указывающих на проблемы валидности, надежности и избыточной упрощенности таких подходов.</w:t>
-      </w:r>
-    </w:p>
-    <w:p>
-      <w:pPr>
-        <w:spacing w:after="0"/>
-        <w:ind w:firstLine="709"/>
-        <w:rPr>
-          <w:lang w:val="ru-RU"/>
-        </w:rPr>
-      </w:pPr>
-    </w:p>
-    <w:p>
-      <w:pPr>
-        <w:spacing w:after="0"/>
-        <w:ind w:firstLine="709"/>
-        <w:rPr>
-          <w:lang w:val="ru-RU"/>
-        </w:rPr>
-      </w:pPr>
-      <w:r>
-        <w:rPr>
-          <w:lang w:val="ru-RU"/>
-        </w:rPr>
-        <w:t>Возникает противоречие между востребованностью простых типологий в обучении, HR и саморазвитии, с одной стороны, и требованиями научной психометрии к строгим диагностическим методам — с другой.</w:t>
-      </w:r>
-    </w:p>
-    <w:p>
-      <w:pPr>
-        <w:spacing w:after="0"/>
-        <w:ind w:firstLine="709"/>
-        <w:rPr>
-          <w:lang w:val="ru-RU"/>
-        </w:rPr>
-      </w:pPr>
-    </w:p>
-    <w:p>
-      <w:pPr>
-        <w:spacing w:after="0"/>
-        <w:ind w:firstLine="709"/>
-        <w:rPr>
-          <w:lang w:val="ru-RU"/>
-        </w:rPr>
       </w:pPr>
       <w:r>
         <w:rPr>
@@ -4391,27 +3632,221 @@
           <w:bCs/>
           <w:lang w:val="ru-RU"/>
         </w:rPr>
-        <w:t>Цель настоящей работы</w:t>
-      </w:r>
-      <w:r>
-        <w:rPr>
-          <w:lang w:val="ru-RU"/>
-        </w:rPr>
-        <w:t xml:space="preserve"> — выполнить сравнительный анализ типологий личности MBTI и соционики и 16-факторного опросника </w:t>
-      </w:r>
-      <w:proofErr w:type="spellStart"/>
-      <w:r>
-        <w:rPr>
-          <w:lang w:val="ru-RU"/>
-        </w:rPr>
-        <w:t>Кеттелла</w:t>
-      </w:r>
-      <w:proofErr w:type="spellEnd"/>
-      <w:r>
-        <w:rPr>
-          <w:lang w:val="ru-RU"/>
-        </w:rPr>
-        <w:t xml:space="preserve"> с точки зрения их теоретических оснований, структуры шкал и области допустимого применения.</w:t>
+        <w:br w:type="page"/>
+      </w:r>
+    </w:p>
+    <w:p>
+      <w:pPr>
+        <w:pStyle w:val="1"/>
+        <w:rPr>
+          <w:lang w:val="ru-RU"/>
+        </w:rPr>
+      </w:pPr>
+      <w:r>
+        <w:rPr>
+          <w:lang w:val="ru-RU"/>
+        </w:rPr>
+        <w:lastRenderedPageBreak/>
+        <w:t>1. Теоретические основы типологических и факторных моделей личности</w:t>
+      </w:r>
+    </w:p>
+    <w:p>
+      <w:pPr>
+        <w:spacing w:after="0"/>
+        <w:ind w:firstLine="709"/>
+        <w:rPr>
+          <w:lang w:val="ru-RU"/>
+        </w:rPr>
+      </w:pPr>
+    </w:p>
+    <w:p>
+      <w:pPr>
+        <w:spacing w:after="0"/>
+        <w:ind w:firstLine="709"/>
+        <w:rPr>
+          <w:lang w:val="ru-RU"/>
+        </w:rPr>
+      </w:pPr>
+      <w:r>
+        <w:rPr>
+          <w:lang w:val="ru-RU"/>
+        </w:rPr>
+        <w:t>Современная дифференциальная психология рассматривает личность как систему относительно устойчивых индивидуальных различий, которые проявляются в типичных способах поведения, переживания и взаимодействия с миром.</w:t>
+      </w:r>
+    </w:p>
+    <w:p>
+      <w:pPr>
+        <w:spacing w:after="0"/>
+        <w:ind w:firstLine="709"/>
+        <w:rPr>
+          <w:lang w:val="ru-RU"/>
+        </w:rPr>
+      </w:pPr>
+    </w:p>
+    <w:p>
+      <w:pPr>
+        <w:spacing w:after="0"/>
+        <w:ind w:firstLine="709"/>
+        <w:rPr>
+          <w:lang w:val="ru-RU"/>
+        </w:rPr>
+      </w:pPr>
+      <w:r>
+        <w:rPr>
+          <w:lang w:val="ru-RU"/>
+        </w:rPr>
+        <w:t>На уровне методологии это порождает два больших подхода к описанию личности: типологический, стремящийся разделить людей на ограниченное число качественно различных типов, и факторный (чертовой), описывающий индивидуальные различия через непрерывные измерения выраженности отдельных свойств.</w:t>
+      </w:r>
+    </w:p>
+    <w:p>
+      <w:pPr>
+        <w:spacing w:after="0"/>
+        <w:ind w:firstLine="709"/>
+        <w:rPr>
+          <w:lang w:val="ru-RU"/>
+        </w:rPr>
+      </w:pPr>
+    </w:p>
+    <w:p>
+      <w:pPr>
+        <w:spacing w:after="0"/>
+        <w:ind w:firstLine="709"/>
+        <w:rPr>
+          <w:lang w:val="ru-RU"/>
+        </w:rPr>
+      </w:pPr>
+      <w:r>
+        <w:rPr>
+          <w:lang w:val="ru-RU"/>
+        </w:rPr>
+        <w:t>Типологические модели привлекательны своей простотой, наглядностью и удобством для повседневного использования: принадлежность к «типу» легко запоминается и превращается в язык для обсуждения различий в коллективе.</w:t>
+      </w:r>
+    </w:p>
+    <w:p>
+      <w:pPr>
+        <w:spacing w:after="0"/>
+        <w:ind w:firstLine="709"/>
+        <w:rPr>
+          <w:lang w:val="ru-RU"/>
+        </w:rPr>
+      </w:pPr>
+    </w:p>
+    <w:p>
+      <w:pPr>
+        <w:spacing w:after="0"/>
+        <w:ind w:firstLine="709"/>
+        <w:rPr>
+          <w:lang w:val="ru-RU"/>
+        </w:rPr>
+      </w:pPr>
+      <w:r>
+        <w:rPr>
+          <w:lang w:val="ru-RU"/>
+        </w:rPr>
+        <w:t xml:space="preserve">Однако разделение людей на небольшое число категорий неизбежно приводит к потере информации о </w:t>
+      </w:r>
+      <w:r>
+        <w:rPr>
+          <w:lang w:val="ru-RU"/>
+        </w:rPr>
+        <w:t>межиндивидуальных</w:t>
+      </w:r>
+      <w:r>
+        <w:rPr>
+          <w:lang w:val="ru-RU"/>
+        </w:rPr>
+        <w:t xml:space="preserve"> различиях внутри типов и риску </w:t>
+      </w:r>
+      <w:r>
+        <w:rPr>
+          <w:lang w:val="ru-RU"/>
+        </w:rPr>
+        <w:t xml:space="preserve">выдавать </w:t>
+      </w:r>
+      <w:r>
+        <w:rPr>
+          <w:lang w:val="ru-RU"/>
+        </w:rPr>
+        <w:t>«ярл</w:t>
+      </w:r>
+      <w:r>
+        <w:rPr>
+          <w:lang w:val="ru-RU"/>
+        </w:rPr>
+        <w:t>ыки</w:t>
+      </w:r>
+      <w:r>
+        <w:rPr>
+          <w:lang w:val="ru-RU"/>
+        </w:rPr>
+        <w:t>» сложны</w:t>
+      </w:r>
+      <w:r>
+        <w:rPr>
+          <w:lang w:val="ru-RU"/>
+        </w:rPr>
+        <w:t>м</w:t>
+      </w:r>
+      <w:r>
+        <w:rPr>
+          <w:lang w:val="ru-RU"/>
+        </w:rPr>
+        <w:t xml:space="preserve"> личностны</w:t>
+      </w:r>
+      <w:r>
+        <w:rPr>
+          <w:lang w:val="ru-RU"/>
+        </w:rPr>
+        <w:t>м</w:t>
+      </w:r>
+      <w:r>
+        <w:rPr>
+          <w:lang w:val="ru-RU"/>
+        </w:rPr>
+        <w:t xml:space="preserve"> профил</w:t>
+      </w:r>
+      <w:r>
+        <w:rPr>
+          <w:lang w:val="ru-RU"/>
+        </w:rPr>
+        <w:t>ям</w:t>
+      </w:r>
+      <w:r>
+        <w:rPr>
+          <w:lang w:val="ru-RU"/>
+        </w:rPr>
+        <w:t>.</w:t>
+      </w:r>
+    </w:p>
+    <w:p>
+      <w:pPr>
+        <w:spacing w:after="0"/>
+        <w:ind w:firstLine="709"/>
+        <w:rPr>
+          <w:lang w:val="ru-RU"/>
+        </w:rPr>
+      </w:pPr>
+    </w:p>
+    <w:p>
+      <w:pPr>
+        <w:spacing w:after="0"/>
+        <w:ind w:firstLine="709"/>
+        <w:rPr>
+          <w:lang w:val="ru-RU"/>
+        </w:rPr>
+      </w:pPr>
+      <w:r>
+        <w:rPr>
+          <w:lang w:val="ru-RU"/>
+        </w:rPr>
+        <w:t xml:space="preserve">Факторные подходы, напротив, исходят из того, что основные черты распределены в популяции континуально, и предлагают </w:t>
+      </w:r>
+      <w:r>
+        <w:rPr>
+          <w:lang w:val="ru-RU"/>
+        </w:rPr>
+        <w:lastRenderedPageBreak/>
+        <w:t>измерять их как количественные переменные, что лучше соответствует статистической природе данных о личности.</w:t>
       </w:r>
     </w:p>
     <w:p>
@@ -4437,59 +3872,133 @@
           <w:bCs/>
           <w:lang w:val="ru-RU"/>
         </w:rPr>
-        <w:t>В рамках этой цели предполагается:</w:t>
-      </w:r>
-      <w:r>
-        <w:rPr>
-          <w:lang w:val="ru-RU"/>
-        </w:rPr>
-        <w:t xml:space="preserve"> проследить генезис указанных моделей, рассмотреть особенности измеряемых конструктов и форматов интерпретации результатов, а также обобщить данные о психометрических свойствах методик и типичных сферах их использования в психологической и около</w:t>
-      </w:r>
-      <w:r>
-        <w:rPr>
-          <w:lang w:val="ru-RU"/>
-        </w:rPr>
-        <w:t xml:space="preserve"> </w:t>
-      </w:r>
-      <w:r>
-        <w:rPr>
-          <w:lang w:val="ru-RU"/>
-        </w:rPr>
-        <w:t>психологической практике.</w:t>
-      </w:r>
-    </w:p>
-    <w:p>
-      <w:pPr>
-        <w:spacing w:line="278" w:lineRule="auto"/>
-        <w:jc w:val="left"/>
+        <w:t>С точки зрения психометрии к любой модели личности предъявляются базовые требования:</w:t>
+      </w:r>
+      <w:r>
+        <w:rPr>
+          <w:lang w:val="ru-RU"/>
+        </w:rPr>
+        <w:t xml:space="preserve"> содержание шкал должно опираться на теорию и эмпирические данные, показатели — демонстрировать приемлемую надёжность (устойчивость измерений) и валидность (соответствие измеряемому конструкту и внешним критериям), а область применения — быть чётко ограниченной.</w:t>
+      </w:r>
+    </w:p>
+    <w:p>
+      <w:pPr>
+        <w:spacing w:after="0"/>
+        <w:ind w:firstLine="709"/>
+        <w:rPr>
+          <w:lang w:val="ru-RU"/>
+        </w:rPr>
+      </w:pPr>
+    </w:p>
+    <w:p>
+      <w:pPr>
+        <w:spacing w:after="0"/>
+        <w:ind w:firstLine="709"/>
+        <w:rPr>
+          <w:lang w:val="ru-RU"/>
+        </w:rPr>
+      </w:pPr>
+      <w:r>
         <w:rPr>
           <w:b/>
           <w:bCs/>
           <w:lang w:val="ru-RU"/>
         </w:rPr>
-      </w:pPr>
+        <w:t>В рамках настоящей работы особый интерес представляют три конкретных реализации этих подходов:</w:t>
+      </w:r>
+      <w:r>
+        <w:rPr>
+          <w:lang w:val="ru-RU"/>
+        </w:rPr>
+        <w:t xml:space="preserve"> типология Майерс–Бриггс (MBTI) и соционика как примеры типологических моделей и 16-факторный опросник Р. Кеттелла (16PF) как классический факторный опросник.</w:t>
+      </w:r>
+    </w:p>
+    <w:p>
+      <w:pPr>
+        <w:spacing w:after="0"/>
+        <w:ind w:firstLine="709"/>
+        <w:rPr>
+          <w:lang w:val="ru-RU"/>
+        </w:rPr>
+      </w:pPr>
+    </w:p>
+    <w:p>
+      <w:pPr>
+        <w:pStyle w:val="2"/>
+        <w:spacing w:after="0"/>
+        <w:ind w:firstLine="709"/>
+        <w:rPr>
+          <w:lang w:val="ru-RU"/>
+        </w:rPr>
+      </w:pPr>
+      <w:r>
+        <w:rPr>
+          <w:lang w:val="ru-RU"/>
+        </w:rPr>
+        <w:t>1.1. Дифференциальная психология и подходы к изучению личности</w:t>
+      </w:r>
+    </w:p>
+    <w:p>
+      <w:pPr>
+        <w:spacing w:after="0"/>
+        <w:ind w:firstLine="709"/>
+        <w:rPr>
+          <w:lang w:val="ru-RU"/>
+        </w:rPr>
+      </w:pPr>
+      <w:r>
+        <w:rPr>
+          <w:lang w:val="ru-RU"/>
+        </w:rPr>
+        <w:t>Дифференциальная психология исторически возникла на стыке психометрии, статистики и индивидуальной психологии и сосредоточена на выявлении и описании устойчивых межиндивидуальных различий.</w:t>
+      </w:r>
+    </w:p>
+    <w:p>
+      <w:pPr>
+        <w:spacing w:after="0"/>
+        <w:ind w:firstLine="709"/>
+        <w:rPr>
+          <w:lang w:val="ru-RU"/>
+        </w:rPr>
+      </w:pPr>
+      <w:r>
+        <w:rPr>
+          <w:lang w:val="ru-RU"/>
+        </w:rPr>
+        <w:t>Ключевыми единицами анализа здесь становятся личностная черта (trait) как относительно стабильная количественная характеристика и личностный тип как качественная комбинация черт, задающая характерный паттерн поведения.</w:t>
+      </w:r>
+    </w:p>
+    <w:p>
+      <w:pPr>
+        <w:spacing w:after="0"/>
+        <w:ind w:firstLine="709"/>
+        <w:rPr>
+          <w:lang w:val="ru-RU"/>
+        </w:rPr>
+      </w:pPr>
+    </w:p>
+    <w:p>
+      <w:pPr>
+        <w:spacing w:after="0"/>
+        <w:ind w:firstLine="709"/>
+        <w:rPr>
+          <w:lang w:val="ru-RU"/>
+        </w:rPr>
+      </w:pPr>
+      <w:r>
+        <w:rPr>
+          <w:lang w:val="ru-RU"/>
+        </w:rPr>
+        <w:lastRenderedPageBreak/>
+        <w:t xml:space="preserve">Типологический подход предполагает, что пространство личностных различий можно разложить на небольшой набор дискретных категорий, внутри которых люди относительно схожи, а между которыми — существенно различаются. </w:t>
+      </w:r>
       <w:r>
         <w:rPr>
           <w:b/>
           <w:bCs/>
           <w:lang w:val="ru-RU"/>
         </w:rPr>
-        <w:br w:type="page"/>
-      </w:r>
-    </w:p>
-    <w:p>
-      <w:pPr>
-        <w:pStyle w:val="1"/>
-        <w:rPr>
-          <w:lang w:val="ru-RU"/>
-        </w:rPr>
-      </w:pPr>
-      <w:r>
-        <w:rPr>
-          <w:lang w:val="ru-RU"/>
-        </w:rPr>
-        <w:lastRenderedPageBreak/>
-        <w:t>1. Теоретические основы типологических и факторных моделей личности</w:t>
+        <w:t>Это характерно для юнгианской традиции и её продолжений в виде MBTI и соционики.</w:t>
       </w:r>
     </w:p>
     <w:p>
@@ -4513,7 +4022,7 @@
         <w:rPr>
           <w:lang w:val="ru-RU"/>
         </w:rPr>
-        <w:t>Современная дифференциальная психология рассматривает личность как систему относительно устойчивых индивидуальных различий, которые проявляются в типичных способах поведения, переживания и взаимодействия с миром.</w:t>
+        <w:t>Факторный подход, напротив, использует методы математической статистики (прежде всего факторный анализ) для выделения латентных измерений, лежащих в основе корреляций между отдельными поведенческими показателями и ответами на опросники, что реализовано в работах Р. Кеттелла и последующих моделей (16PF, Big Five).</w:t>
       </w:r>
     </w:p>
     <w:p>
@@ -4537,7 +4046,7 @@
         <w:rPr>
           <w:lang w:val="ru-RU"/>
         </w:rPr>
-        <w:t>На уровне методологии это порождает два больших подхода к описанию личности: типологический, стремящийся разделить людей на ограниченное число качественно различных типов, и факторный (чертовой), описывающий индивидуальные различия через непрерывные измерения выраженности отдельных свойств.</w:t>
+        <w:t>Современные руководства по психологической диагностике подчёркивают, что для использования опросников в научных и клинических целях необходима демонстрация внутренней согласованности шкал, стабильности результатов во времени и подтверждения факторной структуры на независимых выборках.</w:t>
       </w:r>
     </w:p>
     <w:p>
@@ -4561,7 +4070,7 @@
         <w:rPr>
           <w:lang w:val="ru-RU"/>
         </w:rPr>
-        <w:t>Типологические модели привлекательны своей простотой, наглядностью и удобством для повседневного использования: принадлежность к «типу» легко запоминается и превращается в язык для обсуждения различий в коллективе.</w:t>
+        <w:t>Многие популярные типологические методики (включая MBTI и соционику) удовлетворяют этим критериям лишь частично, что ограничивает область их допустимого применения, тогда как 16PF прошёл более строгую психометрическую апробацию и включён в профессиональные стандарты оценки личности.</w:t>
       </w:r>
     </w:p>
     <w:p>
@@ -4575,6 +4084,7 @@
     </w:p>
     <w:p>
       <w:pPr>
+        <w:pStyle w:val="2"/>
         <w:spacing w:after="0"/>
         <w:ind w:firstLine="709"/>
         <w:rPr>
@@ -4585,122 +4095,8 @@
         <w:rPr>
           <w:lang w:val="ru-RU"/>
         </w:rPr>
-        <w:t xml:space="preserve">Однако разделение людей на небольшое число категорий неизбежно приводит к потере информации о </w:t>
-      </w:r>
-      <w:proofErr w:type="spellStart"/>
-      <w:r>
-        <w:rPr>
-          <w:lang w:val="ru-RU"/>
-        </w:rPr>
-        <w:t>межиндивидуальных</w:t>
-      </w:r>
-      <w:proofErr w:type="spellEnd"/>
-      <w:r>
-        <w:rPr>
-          <w:lang w:val="ru-RU"/>
-        </w:rPr>
-        <w:t xml:space="preserve"> различиях внутри типов и риску </w:t>
-      </w:r>
-      <w:r>
-        <w:rPr>
-          <w:lang w:val="ru-RU"/>
-        </w:rPr>
-        <w:t xml:space="preserve">выдавать </w:t>
-      </w:r>
-      <w:r>
-        <w:rPr>
-          <w:lang w:val="ru-RU"/>
-        </w:rPr>
-        <w:t>«ярл</w:t>
-      </w:r>
-      <w:r>
-        <w:rPr>
-          <w:lang w:val="ru-RU"/>
-        </w:rPr>
-        <w:t>ыки</w:t>
-      </w:r>
-      <w:r>
-        <w:rPr>
-          <w:lang w:val="ru-RU"/>
-        </w:rPr>
-        <w:t>» сложны</w:t>
-      </w:r>
-      <w:r>
-        <w:rPr>
-          <w:lang w:val="ru-RU"/>
-        </w:rPr>
-        <w:t>м</w:t>
-      </w:r>
-      <w:r>
-        <w:rPr>
-          <w:lang w:val="ru-RU"/>
-        </w:rPr>
-        <w:t xml:space="preserve"> личностны</w:t>
-      </w:r>
-      <w:r>
-        <w:rPr>
-          <w:lang w:val="ru-RU"/>
-        </w:rPr>
-        <w:t>м</w:t>
-      </w:r>
-      <w:r>
-        <w:rPr>
-          <w:lang w:val="ru-RU"/>
-        </w:rPr>
-        <w:t xml:space="preserve"> профил</w:t>
-      </w:r>
-      <w:r>
-        <w:rPr>
-          <w:lang w:val="ru-RU"/>
-        </w:rPr>
-        <w:t>ям</w:t>
-      </w:r>
-      <w:r>
-        <w:rPr>
-          <w:lang w:val="ru-RU"/>
-        </w:rPr>
-        <w:t>.</w:t>
-      </w:r>
-    </w:p>
-    <w:p>
-      <w:pPr>
-        <w:spacing w:after="0"/>
-        <w:ind w:firstLine="709"/>
-        <w:rPr>
-          <w:lang w:val="ru-RU"/>
-        </w:rPr>
-      </w:pPr>
-    </w:p>
-    <w:p>
-      <w:pPr>
-        <w:spacing w:after="0"/>
-        <w:ind w:firstLine="709"/>
-        <w:rPr>
-          <w:lang w:val="ru-RU"/>
-        </w:rPr>
-      </w:pPr>
-      <w:r>
-        <w:rPr>
-          <w:lang w:val="ru-RU"/>
-        </w:rPr>
-        <w:t xml:space="preserve">Факторные подходы, напротив, исходят из того, что основные черты распределены в популяции континуально, и предлагают </w:t>
-      </w:r>
-      <w:r>
-        <w:rPr>
-          <w:lang w:val="ru-RU"/>
-        </w:rPr>
-        <w:lastRenderedPageBreak/>
-        <w:t>измерять их как количественные переменные, что лучше соответствует статистической природе данных о личности.</w:t>
-      </w:r>
-    </w:p>
-    <w:p>
-      <w:pPr>
-        <w:spacing w:after="0"/>
-        <w:ind w:firstLine="709"/>
-        <w:rPr>
-          <w:lang w:val="ru-RU"/>
-        </w:rPr>
-      </w:pPr>
+        <w:t>1.2. Юнгианская теория психологических типов как база MBTI и соционики</w:t>
+      </w:r>
     </w:p>
     <w:p>
       <w:pPr>
@@ -4716,13 +4112,62 @@
           <w:bCs/>
           <w:lang w:val="ru-RU"/>
         </w:rPr>
-        <w:t>С точки зрения психометрии к любой модели личности предъявляются базовые требования:</w:t>
-      </w:r>
-      <w:r>
-        <w:rPr>
-          <w:lang w:val="ru-RU"/>
-        </w:rPr>
-        <w:t xml:space="preserve"> содержание шкал должно опираться на теорию и эмпирические данные, показатели — демонстрировать приемлемую надёжность (устойчивость измерений) и валидность (соответствие измеряемому конструкту и внешним критериям), а область применения — быть чётко ограниченной.</w:t>
+        <w:lastRenderedPageBreak/>
+        <w:t xml:space="preserve">Теоретической отправной точкой для MBTI и соционики является работа К. Г. Юнга «Психологические типы», в которой он выделил две установки личности (интроверсию и экстраверсию) и четыре основные психологические функции </w:t>
+      </w:r>
+      <w:r>
+        <w:rPr>
+          <w:lang w:val="ru-RU"/>
+        </w:rPr>
+        <w:t>— мышление, чувство, ощущение и интуицию.</w:t>
+      </w:r>
+    </w:p>
+    <w:p>
+      <w:pPr>
+        <w:spacing w:after="0"/>
+        <w:ind w:firstLine="709"/>
+        <w:rPr>
+          <w:lang w:val="ru-RU"/>
+        </w:rPr>
+      </w:pPr>
+    </w:p>
+    <w:p>
+      <w:pPr>
+        <w:spacing w:after="0"/>
+        <w:ind w:firstLine="709"/>
+        <w:rPr>
+          <w:lang w:val="ru-RU"/>
+        </w:rPr>
+      </w:pPr>
+      <w:r>
+        <w:rPr>
+          <w:lang w:val="ru-RU"/>
+        </w:rPr>
+        <w:t>Юнг описывал типы преимущественно как результат клинических наблюдений, подчёркивая, что речь идёт о «схематизации» реальных людей, тогда как эмпирических тестовых исследований в его работах практически не было.</w:t>
+      </w:r>
+    </w:p>
+    <w:p>
+      <w:pPr>
+        <w:spacing w:after="0"/>
+        <w:ind w:firstLine="709"/>
+        <w:rPr>
+          <w:lang w:val="ru-RU"/>
+        </w:rPr>
+      </w:pPr>
+    </w:p>
+    <w:p>
+      <w:pPr>
+        <w:spacing w:after="0"/>
+        <w:ind w:firstLine="709"/>
+        <w:rPr>
+          <w:lang w:val="ru-RU"/>
+        </w:rPr>
+      </w:pPr>
+      <w:r>
+        <w:rPr>
+          <w:lang w:val="ru-RU"/>
+        </w:rPr>
+        <w:t>Типология Юнга предполагает, что у человека доминирует одна из функций в сочетании с определённой установкой (интровертной или экстравертной), образуя характерный тип реагирования и переработки опыта.</w:t>
       </w:r>
     </w:p>
     <w:p>
@@ -4748,27 +4193,13 @@
           <w:bCs/>
           <w:lang w:val="ru-RU"/>
         </w:rPr>
-        <w:t>В рамках настоящей работы особый интерес представляют три конкретных реализации этих подходов:</w:t>
-      </w:r>
-      <w:r>
-        <w:rPr>
-          <w:lang w:val="ru-RU"/>
-        </w:rPr>
-        <w:t xml:space="preserve"> типология Майерс–Бриггс (MBTI) и соционика как примеры типологических моделей и 16-факторный опросник Р. </w:t>
-      </w:r>
-      <w:proofErr w:type="spellStart"/>
-      <w:r>
-        <w:rPr>
-          <w:lang w:val="ru-RU"/>
-        </w:rPr>
-        <w:t>Кеттелла</w:t>
-      </w:r>
-      <w:proofErr w:type="spellEnd"/>
-      <w:r>
-        <w:rPr>
-          <w:lang w:val="ru-RU"/>
-        </w:rPr>
-        <w:t xml:space="preserve"> (16PF) как классический факторный опросник.</w:t>
+        <w:t>Впоследствии Изабель Бриггс Майерс и Кэтрин Бриггс расширили эту схему, введя дополнительные дихотомии и разработав опросник MBTI, который фиксирует предпочитаемые полюса на четырёх шкалах:</w:t>
+      </w:r>
+      <w:r>
+        <w:rPr>
+          <w:lang w:val="ru-RU"/>
+        </w:rPr>
+        <w:t xml:space="preserve"> экстраверсия–интроверсия, ощущение–интуиция, мышление–чувство и суждение–восприятие.</w:t>
       </w:r>
     </w:p>
     <w:p>
@@ -4782,6 +4213,79 @@
     </w:p>
     <w:p>
       <w:pPr>
+        <w:spacing w:after="0"/>
+        <w:ind w:firstLine="709"/>
+        <w:rPr>
+          <w:lang w:val="ru-RU"/>
+        </w:rPr>
+      </w:pPr>
+      <w:r>
+        <w:rPr>
+          <w:lang w:val="ru-RU"/>
+        </w:rPr>
+        <w:t>Соционика, развивавшаяся в СССР и постсоветском пространстве, во многом наследует юнгианские функции и установки, но дополняет их концепцией «информационного метаболизма» и моделью из восьми функций, распределённых по позициям (модель А).</w:t>
+      </w:r>
+    </w:p>
+    <w:p>
+      <w:pPr>
+        <w:spacing w:after="0"/>
+        <w:ind w:firstLine="709"/>
+        <w:rPr>
+          <w:lang w:val="ru-RU"/>
+        </w:rPr>
+      </w:pPr>
+    </w:p>
+    <w:p>
+      <w:pPr>
+        <w:spacing w:after="0"/>
+        <w:ind w:firstLine="709"/>
+        <w:rPr>
+          <w:lang w:val="ru-RU"/>
+        </w:rPr>
+      </w:pPr>
+      <w:r>
+        <w:rPr>
+          <w:lang w:val="ru-RU"/>
+        </w:rPr>
+        <w:lastRenderedPageBreak/>
+        <w:t>Она также выделяет 16 типов (социотипов), но интерпретирует их через иной набор акцентов (например, межтипные отношения, аспектную структуру функций), что приводит к несовпадению классификаций MBTI и соционики даже при внешнем сходстве обозначений.</w:t>
+      </w:r>
+    </w:p>
+    <w:p>
+      <w:pPr>
+        <w:spacing w:after="0"/>
+        <w:ind w:firstLine="709"/>
+        <w:rPr>
+          <w:lang w:val="ru-RU"/>
+        </w:rPr>
+      </w:pPr>
+    </w:p>
+    <w:p>
+      <w:pPr>
+        <w:spacing w:after="0"/>
+        <w:ind w:firstLine="709"/>
+        <w:rPr>
+          <w:lang w:val="ru-RU"/>
+        </w:rPr>
+      </w:pPr>
+      <w:r>
+        <w:rPr>
+          <w:lang w:val="ru-RU"/>
+        </w:rPr>
+        <w:t>С позиции современной науки юнгианская типология рассматривается скорее как эвристический и клинико-философский конструкт, нежели как полноценно верифицированная психометрическая модель. В частности, отмечаются расплывчатость формулировок функций, трудности операционализации и слабая воспроизводимость типологий в эмпирических исследованиях, что создаёт основания для осторожного использования производных методов (MBTI, соционика) в строгой диагностике.</w:t>
+      </w:r>
+    </w:p>
+    <w:p>
+      <w:pPr>
+        <w:spacing w:after="0"/>
+        <w:ind w:firstLine="709"/>
+        <w:rPr>
+          <w:lang w:val="ru-RU"/>
+        </w:rPr>
+      </w:pPr>
+    </w:p>
+    <w:p>
+      <w:pPr>
         <w:pStyle w:val="2"/>
         <w:spacing w:after="0"/>
         <w:ind w:firstLine="709"/>
@@ -4793,7 +4297,7 @@
         <w:rPr>
           <w:lang w:val="ru-RU"/>
         </w:rPr>
-        <w:t>1.1. Дифференциальная психология и подходы к изучению личности</w:t>
+        <w:t>1.3. Факторно-аналитический подход Р. Кеттелла и модель 16PF</w:t>
       </w:r>
     </w:p>
     <w:p>
@@ -4808,21 +4312,7 @@
         <w:rPr>
           <w:lang w:val="ru-RU"/>
         </w:rPr>
-        <w:t xml:space="preserve">Дифференциальная психология исторически возникла на стыке психометрии, статистики и индивидуальной психологии и сосредоточена на выявлении и описании устойчивых </w:t>
-      </w:r>
-      <w:proofErr w:type="spellStart"/>
-      <w:r>
-        <w:rPr>
-          <w:lang w:val="ru-RU"/>
-        </w:rPr>
-        <w:t>межиндивидуальных</w:t>
-      </w:r>
-      <w:proofErr w:type="spellEnd"/>
-      <w:r>
-        <w:rPr>
-          <w:lang w:val="ru-RU"/>
-        </w:rPr>
-        <w:t xml:space="preserve"> различий.</w:t>
+        <w:t>Факторно-аналитический подход к личности, развитый Р. Кеттеллом, исходит из предположения, что наблюдаемые поведенческие проявления и ответы на опроснике обусловлены меньшим числом латентных факторов.</w:t>
       </w:r>
     </w:p>
     <w:p>
@@ -4833,26 +4323,6 @@
           <w:lang w:val="ru-RU"/>
         </w:rPr>
       </w:pPr>
-      <w:r>
-        <w:rPr>
-          <w:lang w:val="ru-RU"/>
-        </w:rPr>
-        <w:t>Ключевыми единицами анализа здесь становятся личностная черта (</w:t>
-      </w:r>
-      <w:proofErr w:type="spellStart"/>
-      <w:r>
-        <w:rPr>
-          <w:lang w:val="ru-RU"/>
-        </w:rPr>
-        <w:t>trait</w:t>
-      </w:r>
-      <w:proofErr w:type="spellEnd"/>
-      <w:r>
-        <w:rPr>
-          <w:lang w:val="ru-RU"/>
-        </w:rPr>
-        <w:t>) как относительно стабильная количественная характеристика и личностный тип как качественная комбинация черт, задающая характерный паттерн поведения.</w:t>
-      </w:r>
     </w:p>
     <w:p>
       <w:pPr>
@@ -4862,6 +4332,12 @@
           <w:lang w:val="ru-RU"/>
         </w:rPr>
       </w:pPr>
+      <w:r>
+        <w:rPr>
+          <w:lang w:val="ru-RU"/>
+        </w:rPr>
+        <w:t>На основе масштабных исследований и факторного анализа Кеттелл выделил набор первичных личностных факторов, лежащих в основе повседневного поведения, и создал 16-факторный личностный опросник (16PF), предназначенный для их измерения.</w:t>
+      </w:r>
     </w:p>
     <w:p>
       <w:pPr>
@@ -4871,717 +4347,119 @@
           <w:lang w:val="ru-RU"/>
         </w:rPr>
       </w:pPr>
+    </w:p>
+    <w:p>
+      <w:pPr>
+        <w:spacing w:after="0"/>
+        <w:ind w:firstLine="709"/>
+        <w:rPr>
+          <w:lang w:val="ru-RU"/>
+        </w:rPr>
+      </w:pPr>
       <w:r>
         <w:rPr>
           <w:lang w:val="ru-RU"/>
         </w:rPr>
         <w:lastRenderedPageBreak/>
-        <w:t xml:space="preserve">Типологический подход предполагает, что пространство личностных различий можно разложить на небольшой набор дискретных категорий, внутри которых люди относительно схожи, а между которыми — существенно различаются. </w:t>
-      </w:r>
-      <w:r>
+        <w:t>В отличие от типологических схем, 16PF использует континуальные шкалы, на которых каждый фактор измеряется по степени выраженности, что позволяет строить гибкие профили личности вместо отнесения человека к одной из нескольких категорий.</w:t>
+      </w:r>
+    </w:p>
+    <w:p>
+      <w:pPr>
+        <w:spacing w:after="0"/>
+        <w:ind w:firstLine="709"/>
+        <w:rPr>
+          <w:lang w:val="ru-RU"/>
+        </w:rPr>
+      </w:pPr>
+    </w:p>
+    <w:p>
+      <w:pPr>
+        <w:spacing w:after="0"/>
+        <w:ind w:firstLine="709"/>
+        <w:rPr>
+          <w:lang w:val="ru-RU"/>
+        </w:rPr>
+      </w:pPr>
+      <w:r>
+        <w:rPr>
+          <w:lang w:val="ru-RU"/>
+        </w:rPr>
+        <w:t>Такой формат лучше отражает эмпирически наблюдаемое распределение личностных характеристик в популяции и облегчает статистический анализ связей между чертами, поведением и жизненными исходами.</w:t>
+      </w:r>
+    </w:p>
+    <w:p>
+      <w:pPr>
+        <w:spacing w:after="0"/>
+        <w:ind w:firstLine="709"/>
+        <w:rPr>
+          <w:lang w:val="ru-RU"/>
+        </w:rPr>
+      </w:pPr>
+    </w:p>
+    <w:p>
+      <w:pPr>
+        <w:spacing w:after="0"/>
+        <w:ind w:firstLine="709"/>
+        <w:rPr>
+          <w:lang w:val="ru-RU"/>
+        </w:rPr>
+      </w:pPr>
+      <w:r>
+        <w:rPr>
+          <w:lang w:val="ru-RU"/>
+        </w:rPr>
+        <w:t>Психометрические исследования 16PF показывают приемлемую внутреннюю согласованность шкал и воспроизводимость факторной структуры в различных выборках, что позволило опроснику занять устойчивое место в арсенале профессиональной психодиагностики.</w:t>
+      </w:r>
+    </w:p>
+    <w:p>
+      <w:pPr>
+        <w:spacing w:after="0"/>
+        <w:ind w:firstLine="709"/>
+        <w:rPr>
+          <w:lang w:val="ru-RU"/>
+        </w:rPr>
+      </w:pPr>
+    </w:p>
+    <w:p>
+      <w:pPr>
+        <w:spacing w:after="0"/>
+        <w:ind w:firstLine="709"/>
+        <w:rPr>
+          <w:lang w:val="ru-RU"/>
+        </w:rPr>
+      </w:pPr>
+      <w:r>
+        <w:rPr>
+          <w:lang w:val="ru-RU"/>
+        </w:rPr>
+        <w:t>Опросник широко применяется в клинической и консультативной практике, кадровом отборе, профориентации и научных исследованиях, а его шкалы нередко сопоставляются с более поздними моделями, такими как Big Five, что подтверждает связь 16PF с современной чертовой парадигмой.</w:t>
+      </w:r>
+    </w:p>
+    <w:p>
+      <w:pPr>
+        <w:spacing w:after="0"/>
+        <w:ind w:firstLine="709"/>
+        <w:rPr>
+          <w:lang w:val="ru-RU"/>
+        </w:rPr>
+      </w:pPr>
+    </w:p>
+    <w:p>
+      <w:pPr>
+        <w:spacing w:after="0"/>
+        <w:ind w:firstLine="709"/>
         <w:rPr>
           <w:b/>
           <w:bCs/>
           <w:lang w:val="ru-RU"/>
         </w:rPr>
-        <w:t xml:space="preserve">Это характерно для </w:t>
-      </w:r>
-      <w:proofErr w:type="spellStart"/>
-      <w:r>
-        <w:rPr>
-          <w:b/>
-          <w:bCs/>
-          <w:lang w:val="ru-RU"/>
-        </w:rPr>
-        <w:t>юнгианской</w:t>
-      </w:r>
-      <w:proofErr w:type="spellEnd"/>
-      <w:r>
-        <w:rPr>
-          <w:b/>
-          <w:bCs/>
-          <w:lang w:val="ru-RU"/>
-        </w:rPr>
-        <w:t xml:space="preserve"> традиции и её продолжений в виде MBTI и соционики.</w:t>
-      </w:r>
-    </w:p>
-    <w:p>
-      <w:pPr>
-        <w:spacing w:after="0"/>
-        <w:ind w:firstLine="709"/>
-        <w:rPr>
-          <w:lang w:val="ru-RU"/>
-        </w:rPr>
-      </w:pPr>
-    </w:p>
-    <w:p>
-      <w:pPr>
-        <w:spacing w:after="0"/>
-        <w:ind w:firstLine="709"/>
-        <w:rPr>
-          <w:lang w:val="ru-RU"/>
-        </w:rPr>
-      </w:pPr>
-      <w:r>
-        <w:rPr>
-          <w:lang w:val="ru-RU"/>
-        </w:rPr>
-        <w:t xml:space="preserve">Факторный подход, напротив, использует методы математической статистики (прежде всего факторный анализ) для выделения латентных измерений, лежащих в основе корреляций между отдельными поведенческими показателями и ответами на опросники, что реализовано в работах Р. </w:t>
-      </w:r>
-      <w:proofErr w:type="spellStart"/>
-      <w:r>
-        <w:rPr>
-          <w:lang w:val="ru-RU"/>
-        </w:rPr>
-        <w:t>Кеттелла</w:t>
-      </w:r>
-      <w:proofErr w:type="spellEnd"/>
-      <w:r>
-        <w:rPr>
-          <w:lang w:val="ru-RU"/>
-        </w:rPr>
-        <w:t xml:space="preserve"> и последующих моделей (16PF, Big </w:t>
-      </w:r>
-      <w:proofErr w:type="spellStart"/>
-      <w:r>
-        <w:rPr>
-          <w:lang w:val="ru-RU"/>
-        </w:rPr>
-        <w:t>Five</w:t>
-      </w:r>
-      <w:proofErr w:type="spellEnd"/>
-      <w:r>
-        <w:rPr>
-          <w:lang w:val="ru-RU"/>
-        </w:rPr>
-        <w:t>).</w:t>
-      </w:r>
-    </w:p>
-    <w:p>
-      <w:pPr>
-        <w:spacing w:after="0"/>
-        <w:ind w:firstLine="709"/>
-        <w:rPr>
-          <w:lang w:val="ru-RU"/>
-        </w:rPr>
-      </w:pPr>
-    </w:p>
-    <w:p>
-      <w:pPr>
-        <w:spacing w:after="0"/>
-        <w:ind w:firstLine="709"/>
-        <w:rPr>
-          <w:lang w:val="ru-RU"/>
-        </w:rPr>
-      </w:pPr>
-      <w:r>
-        <w:rPr>
-          <w:lang w:val="ru-RU"/>
-        </w:rPr>
-        <w:t>Современные руководства по психологической диагностике подчёркивают, что для использования опросников в научных и клинических целях необходима демонстрация внутренней согласованности шкал, стабильности результатов во времени и подтверждения факторной структуры на независимых выборках.</w:t>
-      </w:r>
-    </w:p>
-    <w:p>
-      <w:pPr>
-        <w:spacing w:after="0"/>
-        <w:ind w:firstLine="709"/>
-        <w:rPr>
-          <w:lang w:val="ru-RU"/>
-        </w:rPr>
-      </w:pPr>
-    </w:p>
-    <w:p>
-      <w:pPr>
-        <w:spacing w:after="0"/>
-        <w:ind w:firstLine="709"/>
-        <w:rPr>
-          <w:lang w:val="ru-RU"/>
-        </w:rPr>
-      </w:pPr>
-      <w:r>
-        <w:rPr>
-          <w:lang w:val="ru-RU"/>
-        </w:rPr>
-        <w:t>Многие популярные типологические методики (включая MBTI и соционику) удовлетворяют этим критериям лишь частично, что ограничивает область их допустимого применения, тогда как 16PF прошёл более строгую психометрическую апробацию и включён в профессиональные стандарты оценки личности.</w:t>
-      </w:r>
-    </w:p>
-    <w:p>
-      <w:pPr>
-        <w:spacing w:after="0"/>
-        <w:ind w:firstLine="709"/>
-        <w:rPr>
-          <w:lang w:val="ru-RU"/>
-        </w:rPr>
-      </w:pPr>
-    </w:p>
-    <w:p>
-      <w:pPr>
-        <w:pStyle w:val="2"/>
-        <w:spacing w:after="0"/>
-        <w:ind w:firstLine="709"/>
-        <w:rPr>
-          <w:lang w:val="ru-RU"/>
-        </w:rPr>
-      </w:pPr>
-      <w:r>
-        <w:rPr>
-          <w:lang w:val="ru-RU"/>
-        </w:rPr>
-        <w:t xml:space="preserve">1.2. </w:t>
-      </w:r>
-      <w:proofErr w:type="spellStart"/>
-      <w:r>
-        <w:rPr>
-          <w:lang w:val="ru-RU"/>
-        </w:rPr>
-        <w:t>Юнгианская</w:t>
-      </w:r>
-      <w:proofErr w:type="spellEnd"/>
-      <w:r>
-        <w:rPr>
-          <w:lang w:val="ru-RU"/>
-        </w:rPr>
-        <w:t xml:space="preserve"> теория психологических типов как база MBTI и соционики</w:t>
-      </w:r>
-    </w:p>
-    <w:p>
-      <w:pPr>
-        <w:spacing w:after="0"/>
-        <w:ind w:firstLine="709"/>
-        <w:rPr>
-          <w:lang w:val="ru-RU"/>
-        </w:rPr>
-      </w:pPr>
-      <w:r>
-        <w:rPr>
-          <w:b/>
-          <w:bCs/>
-          <w:lang w:val="ru-RU"/>
-        </w:rPr>
-        <w:lastRenderedPageBreak/>
-        <w:t xml:space="preserve">Теоретической отправной точкой для MBTI и соционики является работа К. Г. Юнга «Психологические типы», в которой он выделил две установки личности (интроверсию и экстраверсию) и четыре основные психологические функции </w:t>
-      </w:r>
-      <w:r>
-        <w:rPr>
-          <w:lang w:val="ru-RU"/>
-        </w:rPr>
-        <w:t>— мышление, чувство, ощущение и интуицию.</w:t>
-      </w:r>
-    </w:p>
-    <w:p>
-      <w:pPr>
-        <w:spacing w:after="0"/>
-        <w:ind w:firstLine="709"/>
-        <w:rPr>
-          <w:lang w:val="ru-RU"/>
-        </w:rPr>
-      </w:pPr>
-    </w:p>
-    <w:p>
-      <w:pPr>
-        <w:spacing w:after="0"/>
-        <w:ind w:firstLine="709"/>
-        <w:rPr>
-          <w:lang w:val="ru-RU"/>
-        </w:rPr>
-      </w:pPr>
-      <w:r>
-        <w:rPr>
-          <w:lang w:val="ru-RU"/>
-        </w:rPr>
-        <w:t>Юнг описывал типы преимущественно как результат клинических наблюдений, подчёркивая, что речь идёт о «схематизации» реальных людей, тогда как эмпирических тестовых исследований в его работах практически не было.</w:t>
-      </w:r>
-    </w:p>
-    <w:p>
-      <w:pPr>
-        <w:spacing w:after="0"/>
-        <w:ind w:firstLine="709"/>
-        <w:rPr>
-          <w:lang w:val="ru-RU"/>
-        </w:rPr>
-      </w:pPr>
-    </w:p>
-    <w:p>
-      <w:pPr>
-        <w:spacing w:after="0"/>
-        <w:ind w:firstLine="709"/>
-        <w:rPr>
-          <w:lang w:val="ru-RU"/>
-        </w:rPr>
-      </w:pPr>
-      <w:r>
-        <w:rPr>
-          <w:lang w:val="ru-RU"/>
-        </w:rPr>
-        <w:t>Типология Юнга предполагает, что у человека доминирует одна из функций в сочетании с определённой установкой (</w:t>
-      </w:r>
-      <w:proofErr w:type="spellStart"/>
-      <w:r>
-        <w:rPr>
-          <w:lang w:val="ru-RU"/>
-        </w:rPr>
-        <w:t>интровертной</w:t>
-      </w:r>
-      <w:proofErr w:type="spellEnd"/>
-      <w:r>
-        <w:rPr>
-          <w:lang w:val="ru-RU"/>
-        </w:rPr>
-        <w:t xml:space="preserve"> или экстравертной), образуя характерный тип реагирования и переработки опыта.</w:t>
-      </w:r>
-    </w:p>
-    <w:p>
-      <w:pPr>
-        <w:spacing w:after="0"/>
-        <w:ind w:firstLine="709"/>
-        <w:rPr>
-          <w:lang w:val="ru-RU"/>
-        </w:rPr>
-      </w:pPr>
-    </w:p>
-    <w:p>
-      <w:pPr>
-        <w:spacing w:after="0"/>
-        <w:ind w:firstLine="709"/>
-        <w:rPr>
-          <w:lang w:val="ru-RU"/>
-        </w:rPr>
-      </w:pPr>
-      <w:r>
-        <w:rPr>
-          <w:b/>
-          <w:bCs/>
-          <w:lang w:val="ru-RU"/>
-        </w:rPr>
-        <w:t>Впоследствии Изабель Бриггс Майерс и Кэтрин Бриггс расширили эту схему, введя дополнительные дихотомии и разработав опросник MBTI, который фиксирует предпочитаемые полюса на четырёх шкалах:</w:t>
-      </w:r>
-      <w:r>
-        <w:rPr>
-          <w:lang w:val="ru-RU"/>
-        </w:rPr>
-        <w:t xml:space="preserve"> экстраверсия–интроверсия, ощущение–интуиция, мышление–чувство и суждение–восприятие.</w:t>
-      </w:r>
-    </w:p>
-    <w:p>
-      <w:pPr>
-        <w:spacing w:after="0"/>
-        <w:ind w:firstLine="709"/>
-        <w:rPr>
-          <w:lang w:val="ru-RU"/>
-        </w:rPr>
-      </w:pPr>
-    </w:p>
-    <w:p>
-      <w:pPr>
-        <w:spacing w:after="0"/>
-        <w:ind w:firstLine="709"/>
-        <w:rPr>
-          <w:lang w:val="ru-RU"/>
-        </w:rPr>
-      </w:pPr>
-      <w:r>
-        <w:rPr>
-          <w:lang w:val="ru-RU"/>
-        </w:rPr>
-        <w:t xml:space="preserve">Соционика, развивавшаяся в СССР и постсоветском пространстве, во многом наследует </w:t>
-      </w:r>
-      <w:proofErr w:type="spellStart"/>
-      <w:r>
-        <w:rPr>
-          <w:lang w:val="ru-RU"/>
-        </w:rPr>
-        <w:t>юнгианские</w:t>
-      </w:r>
-      <w:proofErr w:type="spellEnd"/>
-      <w:r>
-        <w:rPr>
-          <w:lang w:val="ru-RU"/>
-        </w:rPr>
-        <w:t xml:space="preserve"> функции и установки, но дополняет их концепцией «информационного метаболизма» и моделью из восьми функций, распределённых по позициям (модель А).</w:t>
-      </w:r>
-    </w:p>
-    <w:p>
-      <w:pPr>
-        <w:spacing w:after="0"/>
-        <w:ind w:firstLine="709"/>
-        <w:rPr>
-          <w:lang w:val="ru-RU"/>
-        </w:rPr>
-      </w:pPr>
-    </w:p>
-    <w:p>
-      <w:pPr>
-        <w:spacing w:after="0"/>
-        <w:ind w:firstLine="709"/>
-        <w:rPr>
-          <w:lang w:val="ru-RU"/>
-        </w:rPr>
-      </w:pPr>
-      <w:r>
-        <w:rPr>
-          <w:lang w:val="ru-RU"/>
-        </w:rPr>
-        <w:lastRenderedPageBreak/>
-        <w:t xml:space="preserve">Она также выделяет 16 типов (социотипов), но интерпретирует их через иной набор акцентов (например, </w:t>
-      </w:r>
-      <w:proofErr w:type="spellStart"/>
-      <w:r>
-        <w:rPr>
-          <w:lang w:val="ru-RU"/>
-        </w:rPr>
-        <w:t>межтипные</w:t>
-      </w:r>
-      <w:proofErr w:type="spellEnd"/>
-      <w:r>
-        <w:rPr>
-          <w:lang w:val="ru-RU"/>
-        </w:rPr>
-        <w:t xml:space="preserve"> отношения, аспектную структуру функций), что приводит к несовпадению классификаций MBTI и соционики даже при внешнем сходстве обозначений.</w:t>
-      </w:r>
-    </w:p>
-    <w:p>
-      <w:pPr>
-        <w:spacing w:after="0"/>
-        <w:ind w:firstLine="709"/>
-        <w:rPr>
-          <w:lang w:val="ru-RU"/>
-        </w:rPr>
-      </w:pPr>
-    </w:p>
-    <w:p>
-      <w:pPr>
-        <w:spacing w:after="0"/>
-        <w:ind w:firstLine="709"/>
-        <w:rPr>
-          <w:lang w:val="ru-RU"/>
-        </w:rPr>
-      </w:pPr>
-      <w:r>
-        <w:rPr>
-          <w:lang w:val="ru-RU"/>
-        </w:rPr>
-        <w:t xml:space="preserve">С позиции современной науки </w:t>
-      </w:r>
-      <w:proofErr w:type="spellStart"/>
-      <w:r>
-        <w:rPr>
-          <w:lang w:val="ru-RU"/>
-        </w:rPr>
-        <w:t>юнгианская</w:t>
-      </w:r>
-      <w:proofErr w:type="spellEnd"/>
-      <w:r>
-        <w:rPr>
-          <w:lang w:val="ru-RU"/>
-        </w:rPr>
-        <w:t xml:space="preserve"> типология рассматривается скорее как эвристический и клинико-философский конструкт, нежели как полноценно верифицированная психометрическая модель. В частности, отмечаются расплывчатость формулировок функций, трудности </w:t>
-      </w:r>
-      <w:proofErr w:type="spellStart"/>
-      <w:r>
-        <w:rPr>
-          <w:lang w:val="ru-RU"/>
-        </w:rPr>
-        <w:t>операционализации</w:t>
-      </w:r>
-      <w:proofErr w:type="spellEnd"/>
-      <w:r>
-        <w:rPr>
-          <w:lang w:val="ru-RU"/>
-        </w:rPr>
-        <w:t xml:space="preserve"> и слабая воспроизводимость типологий в эмпирических исследованиях, что создаёт основания для осторожного использования производных методов (MBTI, соционика) в строгой диагностике.</w:t>
-      </w:r>
-    </w:p>
-    <w:p>
-      <w:pPr>
-        <w:spacing w:after="0"/>
-        <w:ind w:firstLine="709"/>
-        <w:rPr>
-          <w:lang w:val="ru-RU"/>
-        </w:rPr>
-      </w:pPr>
-    </w:p>
-    <w:p>
-      <w:pPr>
-        <w:pStyle w:val="2"/>
-        <w:spacing w:after="0"/>
-        <w:ind w:firstLine="709"/>
-        <w:rPr>
-          <w:lang w:val="ru-RU"/>
-        </w:rPr>
-      </w:pPr>
-      <w:r>
-        <w:rPr>
-          <w:lang w:val="ru-RU"/>
-        </w:rPr>
-        <w:t xml:space="preserve">1.3. </w:t>
-      </w:r>
-      <w:proofErr w:type="spellStart"/>
-      <w:r>
-        <w:rPr>
-          <w:lang w:val="ru-RU"/>
-        </w:rPr>
-        <w:t>Факторно</w:t>
-      </w:r>
-      <w:proofErr w:type="spellEnd"/>
-      <w:r>
-        <w:rPr>
-          <w:lang w:val="ru-RU"/>
-        </w:rPr>
-        <w:t xml:space="preserve">-аналитический подход Р. </w:t>
-      </w:r>
-      <w:proofErr w:type="spellStart"/>
-      <w:r>
-        <w:rPr>
-          <w:lang w:val="ru-RU"/>
-        </w:rPr>
-        <w:t>Кеттелла</w:t>
-      </w:r>
-      <w:proofErr w:type="spellEnd"/>
-      <w:r>
-        <w:rPr>
-          <w:lang w:val="ru-RU"/>
-        </w:rPr>
-        <w:t xml:space="preserve"> и модель 16PF</w:t>
-      </w:r>
-    </w:p>
-    <w:p>
-      <w:pPr>
-        <w:spacing w:after="0"/>
-        <w:ind w:firstLine="709"/>
-        <w:rPr>
-          <w:lang w:val="ru-RU"/>
-        </w:rPr>
-      </w:pPr>
-      <w:proofErr w:type="spellStart"/>
-      <w:r>
-        <w:rPr>
-          <w:lang w:val="ru-RU"/>
-        </w:rPr>
-        <w:t>Факторно</w:t>
-      </w:r>
-      <w:proofErr w:type="spellEnd"/>
-      <w:r>
-        <w:rPr>
-          <w:lang w:val="ru-RU"/>
-        </w:rPr>
-        <w:t xml:space="preserve">-аналитический подход к личности, развитый Р. </w:t>
-      </w:r>
-      <w:proofErr w:type="spellStart"/>
-      <w:r>
-        <w:rPr>
-          <w:lang w:val="ru-RU"/>
-        </w:rPr>
-        <w:t>Кеттеллом</w:t>
-      </w:r>
-      <w:proofErr w:type="spellEnd"/>
-      <w:r>
-        <w:rPr>
-          <w:lang w:val="ru-RU"/>
-        </w:rPr>
-        <w:t>, исходит из предположения, что наблюдаемые поведенческие проявления и ответы на опроснике обусловлены меньшим числом латентных факторов.</w:t>
-      </w:r>
-    </w:p>
-    <w:p>
-      <w:pPr>
-        <w:spacing w:after="0"/>
-        <w:ind w:firstLine="709"/>
-        <w:rPr>
-          <w:lang w:val="ru-RU"/>
-        </w:rPr>
-      </w:pPr>
-    </w:p>
-    <w:p>
-      <w:pPr>
-        <w:spacing w:after="0"/>
-        <w:ind w:firstLine="709"/>
-        <w:rPr>
-          <w:lang w:val="ru-RU"/>
-        </w:rPr>
-      </w:pPr>
-      <w:r>
-        <w:rPr>
-          <w:lang w:val="ru-RU"/>
-        </w:rPr>
-        <w:t xml:space="preserve">На основе масштабных исследований и факторного анализа </w:t>
-      </w:r>
-      <w:proofErr w:type="spellStart"/>
-      <w:r>
-        <w:rPr>
-          <w:lang w:val="ru-RU"/>
-        </w:rPr>
-        <w:t>Кеттелл</w:t>
-      </w:r>
-      <w:proofErr w:type="spellEnd"/>
-      <w:r>
-        <w:rPr>
-          <w:lang w:val="ru-RU"/>
-        </w:rPr>
-        <w:t xml:space="preserve"> выделил набор первичных личностных факторов, лежащих в основе повседневного поведения, и создал 16-факторный личностный опросник (16PF), предназначенный для их измерения.</w:t>
-      </w:r>
-    </w:p>
-    <w:p>
-      <w:pPr>
-        <w:spacing w:after="0"/>
-        <w:ind w:firstLine="709"/>
-        <w:rPr>
-          <w:lang w:val="ru-RU"/>
-        </w:rPr>
-      </w:pPr>
-    </w:p>
-    <w:p>
-      <w:pPr>
-        <w:spacing w:after="0"/>
-        <w:ind w:firstLine="709"/>
-        <w:rPr>
-          <w:lang w:val="ru-RU"/>
-        </w:rPr>
-      </w:pPr>
-      <w:r>
-        <w:rPr>
-          <w:lang w:val="ru-RU"/>
-        </w:rPr>
-        <w:lastRenderedPageBreak/>
-        <w:t>В отличие от типологических схем, 16PF использует континуальные шкалы, на которых каждый фактор измеряется по степени выраженности, что позволяет строить гибкие профили личности вместо отнесения человека к одной из нескольких категорий.</w:t>
-      </w:r>
-    </w:p>
-    <w:p>
-      <w:pPr>
-        <w:spacing w:after="0"/>
-        <w:ind w:firstLine="709"/>
-        <w:rPr>
-          <w:lang w:val="ru-RU"/>
-        </w:rPr>
-      </w:pPr>
-    </w:p>
-    <w:p>
-      <w:pPr>
-        <w:spacing w:after="0"/>
-        <w:ind w:firstLine="709"/>
-        <w:rPr>
-          <w:lang w:val="ru-RU"/>
-        </w:rPr>
-      </w:pPr>
-      <w:r>
-        <w:rPr>
-          <w:lang w:val="ru-RU"/>
-        </w:rPr>
-        <w:t>Такой формат лучше отражает эмпирически наблюдаемое распределение личностных характеристик в популяции и облегчает статистический анализ связей между чертами, поведением и жизненными исходами.</w:t>
-      </w:r>
-    </w:p>
-    <w:p>
-      <w:pPr>
-        <w:spacing w:after="0"/>
-        <w:ind w:firstLine="709"/>
-        <w:rPr>
-          <w:lang w:val="ru-RU"/>
-        </w:rPr>
-      </w:pPr>
-    </w:p>
-    <w:p>
-      <w:pPr>
-        <w:spacing w:after="0"/>
-        <w:ind w:firstLine="709"/>
-        <w:rPr>
-          <w:lang w:val="ru-RU"/>
-        </w:rPr>
-      </w:pPr>
-      <w:r>
-        <w:rPr>
-          <w:lang w:val="ru-RU"/>
-        </w:rPr>
-        <w:t>Психометрические исследования 16PF показывают приемлемую внутреннюю согласованность шкал и воспроизводимость факторной структуры в различных выборках, что позволило опроснику занять устойчивое место в арсенале профессиональной психодиагностики.</w:t>
-      </w:r>
-    </w:p>
-    <w:p>
-      <w:pPr>
-        <w:spacing w:after="0"/>
-        <w:ind w:firstLine="709"/>
-        <w:rPr>
-          <w:lang w:val="ru-RU"/>
-        </w:rPr>
-      </w:pPr>
-    </w:p>
-    <w:p>
-      <w:pPr>
-        <w:spacing w:after="0"/>
-        <w:ind w:firstLine="709"/>
-        <w:rPr>
-          <w:lang w:val="ru-RU"/>
-        </w:rPr>
-      </w:pPr>
-      <w:r>
-        <w:rPr>
-          <w:lang w:val="ru-RU"/>
-        </w:rPr>
-        <w:t xml:space="preserve">Опросник широко применяется в клинической и консультативной практике, кадровом отборе, профориентации и научных исследованиях, а его шкалы нередко сопоставляются с более поздними моделями, такими как Big </w:t>
-      </w:r>
-      <w:proofErr w:type="spellStart"/>
-      <w:r>
-        <w:rPr>
-          <w:lang w:val="ru-RU"/>
-        </w:rPr>
-        <w:t>Five</w:t>
-      </w:r>
-      <w:proofErr w:type="spellEnd"/>
-      <w:r>
-        <w:rPr>
-          <w:lang w:val="ru-RU"/>
-        </w:rPr>
-        <w:t>, что подтверждает связь 16PF с современной чертовой парадигмой.</w:t>
-      </w:r>
-    </w:p>
-    <w:p>
-      <w:pPr>
-        <w:spacing w:after="0"/>
-        <w:ind w:firstLine="709"/>
-        <w:rPr>
-          <w:lang w:val="ru-RU"/>
-        </w:rPr>
-      </w:pPr>
-    </w:p>
-    <w:p>
-      <w:pPr>
-        <w:spacing w:after="0"/>
-        <w:ind w:firstLine="709"/>
-        <w:rPr>
-          <w:b/>
-          <w:bCs/>
-          <w:lang w:val="ru-RU"/>
-        </w:rPr>
-      </w:pPr>
-      <w:r>
-        <w:rPr>
-          <w:lang w:val="ru-RU"/>
-        </w:rPr>
-        <w:t xml:space="preserve">Таким образом, уже на уровне теоретических оснований видно, что MBTI и соционика опираются на </w:t>
-      </w:r>
-      <w:proofErr w:type="spellStart"/>
-      <w:r>
-        <w:rPr>
-          <w:lang w:val="ru-RU"/>
-        </w:rPr>
-        <w:t>юнгианскую</w:t>
-      </w:r>
-      <w:proofErr w:type="spellEnd"/>
-      <w:r>
-        <w:rPr>
-          <w:lang w:val="ru-RU"/>
-        </w:rPr>
-        <w:t xml:space="preserve"> типологию и ориентированы на качественное разделение людей на типы, тогда как 16PF строится в логике </w:t>
-      </w:r>
-      <w:proofErr w:type="spellStart"/>
-      <w:r>
-        <w:rPr>
-          <w:lang w:val="ru-RU"/>
-        </w:rPr>
-        <w:t>факторно</w:t>
-      </w:r>
-      <w:proofErr w:type="spellEnd"/>
-      <w:r>
-        <w:rPr>
-          <w:lang w:val="ru-RU"/>
-        </w:rPr>
-        <w:t>-аналитического подхода и реализует количественное измерение личностных черт</w:t>
+      </w:pPr>
+      <w:r>
+        <w:rPr>
+          <w:lang w:val="ru-RU"/>
+        </w:rPr>
+        <w:t>Таким образом, уже на уровне теоретических оснований видно, что MBTI и соционика опираются на юнгианскую типологию и ориентированы на качественное разделение людей на типы, тогда как 16PF строится в логике факторно-аналитического подхода и реализует количественное измерение личностных черт</w:t>
       </w:r>
       <w:r>
         <w:rPr>
@@ -5790,23 +4668,7 @@
         <w:ind w:left="0" w:firstLine="709"/>
       </w:pPr>
       <w:r>
-        <w:t xml:space="preserve">Myers I. B., </w:t>
-      </w:r>
-      <w:proofErr w:type="spellStart"/>
-      <w:r>
-        <w:t>McCaulley</w:t>
-      </w:r>
-      <w:proofErr w:type="spellEnd"/>
-      <w:r>
-        <w:t xml:space="preserve"> M. H., </w:t>
-      </w:r>
-      <w:proofErr w:type="spellStart"/>
-      <w:r>
-        <w:t>Quenk</w:t>
-      </w:r>
-      <w:proofErr w:type="spellEnd"/>
-      <w:r>
-        <w:t xml:space="preserve"> N. L., Hammer A. L. MBTI Manual: A Guide to the Development and Use of the Myers-Briggs Type Indicator. — 3rd ed. — Palo Alto, CA: Consulting Psychologists Press, 1998. — 420 p. — ISBN 978-0-89106-130-3.</w:t>
+        <w:t>Myers I. B., McCaulley M. H., Quenk N. L., Hammer A. L. MBTI Manual: A Guide to the Development and Use of the Myers-Briggs Type Indicator. — 3rd ed. — Palo Alto, CA: Consulting Psychologists Press, 1998. — 420 p. — ISBN 978-0-89106-130-3.</w:t>
       </w:r>
     </w:p>
     <w:p>
@@ -5818,14 +4680,12 @@
         <w:spacing w:after="0"/>
         <w:ind w:left="0" w:firstLine="709"/>
       </w:pPr>
-      <w:proofErr w:type="spellStart"/>
       <w:r>
         <w:rPr>
           <w:lang w:val="ru-RU"/>
         </w:rPr>
         <w:t>Зарате</w:t>
       </w:r>
-      <w:proofErr w:type="spellEnd"/>
       <w:r>
         <w:t>-</w:t>
       </w:r>
@@ -5925,13 +4785,8 @@
         <w:spacing w:after="0"/>
         <w:ind w:left="0" w:firstLine="709"/>
       </w:pPr>
-      <w:proofErr w:type="spellStart"/>
-      <w:r>
-        <w:t>Barbuto</w:t>
-      </w:r>
-      <w:proofErr w:type="spellEnd"/>
-      <w:r>
-        <w:t xml:space="preserve"> J. E. A Critique of the Myers-Briggs Type Indicator and its Operationalization // Psychological Reports. — 1997. — Vol. 80, No. 2. — P. 611–625. — DOI: 10.2466/pr0.1997.80.2.611.</w:t>
+      <w:r>
+        <w:t>Barbuto J. E. A Critique of the Myers-Briggs Type Indicator and its Operationalization // Psychological Reports. — 1997. — Vol. 80, No. 2. — P. 611–625. — DOI: 10.2466/pr0.1997.80.2.611.</w:t>
       </w:r>
     </w:p>
     <w:p>
@@ -5981,34 +4836,12 @@
           <w:lang w:val="ru-RU"/>
         </w:rPr>
       </w:pPr>
-      <w:proofErr w:type="spellStart"/>
       <w:r>
         <w:rPr>
           <w:lang w:val="ru-RU"/>
         </w:rPr>
         <w:lastRenderedPageBreak/>
-        <w:t>Кеттелл</w:t>
-      </w:r>
-      <w:proofErr w:type="spellEnd"/>
-      <w:r>
-        <w:rPr>
-          <w:lang w:val="ru-RU"/>
-        </w:rPr>
-        <w:t xml:space="preserve"> Р. Б., </w:t>
-      </w:r>
-      <w:proofErr w:type="spellStart"/>
-      <w:r>
-        <w:rPr>
-          <w:lang w:val="ru-RU"/>
-        </w:rPr>
-        <w:t>Кеттелл</w:t>
-      </w:r>
-      <w:proofErr w:type="spellEnd"/>
-      <w:r>
-        <w:rPr>
-          <w:lang w:val="ru-RU"/>
-        </w:rPr>
-        <w:t xml:space="preserve"> А. К. 16-факторный личностный опросник: Руководство по применению. — СПб.: Речь, 2003. — 192 с. — ISBN 5-9268-0070-8.</w:t>
+        <w:t>Кеттелл Р. Б., Кеттелл А. К. 16-факторный личностный опросник: Руководство по применению. — СПб.: Речь, 2003. — 192 с. — ISBN 5-9268-0070-8.</w:t>
       </w:r>
     </w:p>
     <w:p>
@@ -6021,15 +4854,7 @@
         <w:ind w:left="0" w:firstLine="709"/>
       </w:pPr>
       <w:r>
-        <w:t xml:space="preserve">Cattell R. B., Eber H. W., </w:t>
-      </w:r>
-      <w:proofErr w:type="spellStart"/>
-      <w:r>
-        <w:t>Tatsuoka</w:t>
-      </w:r>
-      <w:proofErr w:type="spellEnd"/>
-      <w:r>
-        <w:t xml:space="preserve"> M. M. Handbook for the Sixteen Personality Factor Questionnaire (16PF). — Champaign, IL: Institute for Personality and Ability Testing, 1970. — 452 p.</w:t>
+        <w:t>Cattell R. B., Eber H. W., Tatsuoka M. M. Handbook for the Sixteen Personality Factor Questionnaire (16PF). — Champaign, IL: Institute for Personality and Ability Testing, 1970. — 452 p.</w:t>
       </w:r>
     </w:p>
     <w:p>
@@ -6121,15 +4946,7 @@
         <w:t>базе</w:t>
       </w:r>
       <w:r>
-        <w:t xml:space="preserve"> </w:t>
-      </w:r>
-      <w:proofErr w:type="spellStart"/>
-      <w:r>
-        <w:t>eLIBRARY</w:t>
-      </w:r>
-      <w:proofErr w:type="spellEnd"/>
-      <w:r>
-        <w:t xml:space="preserve"> </w:t>
+        <w:t xml:space="preserve"> eLIBRARY </w:t>
       </w:r>
       <w:r>
         <w:rPr>
@@ -6153,21 +4970,8 @@
           <w:lang w:val="ru-RU"/>
         </w:rPr>
       </w:pPr>
-      <w:proofErr w:type="spellStart"/>
-      <w:r>
-        <w:t>Augustinavichiute</w:t>
-      </w:r>
-      <w:proofErr w:type="spellEnd"/>
-      <w:r>
-        <w:t xml:space="preserve"> A. The Dual Nature of Man // Socionics, </w:t>
-      </w:r>
-      <w:proofErr w:type="spellStart"/>
-      <w:r>
-        <w:t>Mentology</w:t>
-      </w:r>
-      <w:proofErr w:type="spellEnd"/>
-      <w:r>
-        <w:t xml:space="preserve"> and Personality Psychology. — 1995. — No. 1. — P. 5–15. </w:t>
+      <w:r>
+        <w:t xml:space="preserve">Augustinavichiute A. The Dual Nature of Man // Socionics, Mentology and Personality Psychology. — 1995. — No. 1. — P. 5–15. </w:t>
       </w:r>
       <w:r>
         <w:rPr>
@@ -6188,19 +4992,11 @@
           <w:lang w:val="ru-RU"/>
         </w:rPr>
       </w:pPr>
-      <w:proofErr w:type="spellStart"/>
-      <w:r>
-        <w:rPr>
-          <w:lang w:val="ru-RU"/>
-        </w:rPr>
-        <w:t>Кострикoва</w:t>
-      </w:r>
-      <w:proofErr w:type="spellEnd"/>
-      <w:r>
-        <w:rPr>
-          <w:lang w:val="ru-RU"/>
-        </w:rPr>
-        <w:t xml:space="preserve"> И. С. Введение в соционику. — М.: АСТ, 2014. — 320 с. — ISBN 978-5-17-083905-0</w:t>
+      <w:r>
+        <w:rPr>
+          <w:lang w:val="ru-RU"/>
+        </w:rPr>
+        <w:t>Кострикoва И. С. Введение в соционику. — М.: АСТ, 2014. — 320 с. — ISBN 978-5-17-083905-0</w:t>
       </w:r>
       <w:r>
         <w:rPr>
@@ -6224,13 +5020,8 @@
         <w:spacing w:after="0"/>
         <w:ind w:left="0" w:firstLine="709"/>
       </w:pPr>
-      <w:proofErr w:type="spellStart"/>
-      <w:r>
-        <w:t>Reinin</w:t>
-      </w:r>
-      <w:proofErr w:type="spellEnd"/>
-      <w:r>
-        <w:t xml:space="preserve"> G. V. The Socionic Model of Information Metabolism: A Review // SSRN Electronic Journal. — 2022. — DOI: 10.2139/ssrn.3001323. — URL: </w:t>
+      <w:r>
+        <w:t xml:space="preserve">Reinin G. V. The Socionic Model of Information Metabolism: A Review // SSRN Electronic Journal. — 2022. — DOI: 10.2139/ssrn.3001323. — URL: </w:t>
       </w:r>
       <w:hyperlink r:id="rId12" w:history="1">
         <w:r>
@@ -6276,15 +5067,7 @@
       </w:pPr>
       <w:r>
         <w:lastRenderedPageBreak/>
-        <w:t xml:space="preserve">Socionics // </w:t>
-      </w:r>
-      <w:proofErr w:type="spellStart"/>
-      <w:r>
-        <w:t>WikiDoc</w:t>
-      </w:r>
-      <w:proofErr w:type="spellEnd"/>
-      <w:r>
-        <w:t xml:space="preserve">. — 2012. — URL: </w:t>
+        <w:t xml:space="preserve">Socionics // WikiDoc. — 2012. — URL: </w:t>
       </w:r>
       <w:hyperlink r:id="rId13" w:history="1">
         <w:r>
@@ -6331,47 +5114,11 @@
           <w:lang w:val="ru-RU"/>
         </w:rPr>
       </w:pPr>
-      <w:proofErr w:type="spellStart"/>
-      <w:r>
-        <w:rPr>
-          <w:lang w:val="ru-RU"/>
-        </w:rPr>
-        <w:t>Myers-Briggs</w:t>
-      </w:r>
-      <w:proofErr w:type="spellEnd"/>
-      <w:r>
-        <w:rPr>
-          <w:lang w:val="ru-RU"/>
-        </w:rPr>
-        <w:t xml:space="preserve"> Type </w:t>
-      </w:r>
-      <w:proofErr w:type="spellStart"/>
-      <w:r>
-        <w:rPr>
-          <w:lang w:val="ru-RU"/>
-        </w:rPr>
-        <w:t>Indicator</w:t>
-      </w:r>
-      <w:proofErr w:type="spellEnd"/>
-      <w:r>
-        <w:rPr>
-          <w:lang w:val="ru-RU"/>
-        </w:rPr>
-        <w:t xml:space="preserve"> (MBTI) // </w:t>
-      </w:r>
-      <w:proofErr w:type="spellStart"/>
-      <w:r>
-        <w:rPr>
-          <w:lang w:val="ru-RU"/>
-        </w:rPr>
-        <w:t>SimplyPsychology</w:t>
-      </w:r>
-      <w:proofErr w:type="spellEnd"/>
-      <w:r>
-        <w:rPr>
-          <w:lang w:val="ru-RU"/>
-        </w:rPr>
-        <w:t xml:space="preserve">. — 19.10.2025. — URL: </w:t>
+      <w:r>
+        <w:rPr>
+          <w:lang w:val="ru-RU"/>
+        </w:rPr>
+        <w:t xml:space="preserve">Myers-Briggs Type Indicator (MBTI) // SimplyPsychology. — 19.10.2025. — URL: </w:t>
       </w:r>
       <w:hyperlink r:id="rId14" w:history="1">
         <w:r>
@@ -6437,14 +5184,12 @@
         </w:rPr>
         <w:t xml:space="preserve"> // </w:t>
       </w:r>
-      <w:proofErr w:type="spellStart"/>
       <w:r>
         <w:rPr>
           <w:lang w:val="fr-FR"/>
         </w:rPr>
         <w:t>Wikipedia</w:t>
       </w:r>
-      <w:proofErr w:type="spellEnd"/>
       <w:r>
         <w:rPr>
           <w:lang w:val="ru-RU"/>
@@ -6492,7 +5237,6 @@
           </w:rPr>
           <w:t>.</w:t>
         </w:r>
-        <w:proofErr w:type="spellStart"/>
         <w:r>
           <w:rPr>
             <w:rStyle w:val="a4"/>
@@ -6500,7 +5244,6 @@
           </w:rPr>
           <w:t>wikipedia</w:t>
         </w:r>
-        <w:proofErr w:type="spellEnd"/>
         <w:r>
           <w:rPr>
             <w:rStyle w:val="a4"/>
@@ -6508,7 +5251,6 @@
           </w:rPr>
           <w:t>.</w:t>
         </w:r>
-        <w:proofErr w:type="spellStart"/>
         <w:r>
           <w:rPr>
             <w:rStyle w:val="a4"/>
@@ -6516,7 +5258,6 @@
           </w:rPr>
           <w:t>org</w:t>
         </w:r>
-        <w:proofErr w:type="spellEnd"/>
         <w:r>
           <w:rPr>
             <w:rStyle w:val="a4"/>
@@ -6652,15 +5393,7 @@
         <w:ind w:left="0" w:firstLine="709"/>
       </w:pPr>
       <w:r>
-        <w:t xml:space="preserve">Ultimate Guide to Socionics and Personality Types // </w:t>
-      </w:r>
-      <w:proofErr w:type="spellStart"/>
-      <w:r>
-        <w:t>FormPlus</w:t>
-      </w:r>
-      <w:proofErr w:type="spellEnd"/>
-      <w:r>
-        <w:t xml:space="preserve"> Blog. — 19.04.2022. — URL: </w:t>
+        <w:t xml:space="preserve">Ultimate Guide to Socionics and Personality Types // FormPlus Blog. — 19.04.2022. — URL: </w:t>
       </w:r>
       <w:hyperlink r:id="rId17" w:history="1">
         <w:r>
@@ -6750,15 +5483,7 @@
         <w:ind w:left="0" w:firstLine="709"/>
       </w:pPr>
       <w:r>
-        <w:t xml:space="preserve">The 16PF and MBTI Questionnaires – A Perfect Match // </w:t>
-      </w:r>
-      <w:proofErr w:type="spellStart"/>
-      <w:r>
-        <w:t>NovaConnection</w:t>
-      </w:r>
-      <w:proofErr w:type="spellEnd"/>
-      <w:r>
-        <w:t xml:space="preserve">. — URL: </w:t>
+        <w:t xml:space="preserve">The 16PF and MBTI Questionnaires – A Perfect Match // NovaConnection. — URL: </w:t>
       </w:r>
       <w:hyperlink r:id="rId19" w:history="1">
         <w:r>
@@ -6963,49 +5688,7 @@
         <w:rPr>
           <w:lang w:val="ru-RU"/>
         </w:rPr>
-        <w:t xml:space="preserve">Сравнение MBTI и 16PF (форум и обзор) // </w:t>
-      </w:r>
-      <w:proofErr w:type="spellStart"/>
-      <w:r>
-        <w:rPr>
-          <w:lang w:val="ru-RU"/>
-        </w:rPr>
-        <w:t>This</w:t>
-      </w:r>
-      <w:proofErr w:type="spellEnd"/>
-      <w:r>
-        <w:rPr>
-          <w:lang w:val="ru-RU"/>
-        </w:rPr>
-        <w:t xml:space="preserve"> </w:t>
-      </w:r>
-      <w:proofErr w:type="spellStart"/>
-      <w:r>
-        <w:rPr>
-          <w:lang w:val="ru-RU"/>
-        </w:rPr>
-        <w:t>vs</w:t>
-      </w:r>
-      <w:proofErr w:type="spellEnd"/>
-      <w:r>
-        <w:rPr>
-          <w:lang w:val="ru-RU"/>
-        </w:rPr>
-        <w:t xml:space="preserve">. </w:t>
-      </w:r>
-      <w:proofErr w:type="spellStart"/>
-      <w:r>
-        <w:rPr>
-          <w:lang w:val="ru-RU"/>
-        </w:rPr>
-        <w:t>That</w:t>
-      </w:r>
-      <w:proofErr w:type="spellEnd"/>
-      <w:r>
-        <w:rPr>
-          <w:lang w:val="ru-RU"/>
-        </w:rPr>
-        <w:t xml:space="preserve">. — URL: </w:t>
+        <w:t xml:space="preserve">Сравнение MBTI и 16PF (форум и обзор) // This vs. That. — URL: </w:t>
       </w:r>
       <w:hyperlink r:id="rId23" w:history="1">
         <w:r>
@@ -7045,21 +5728,7 @@
         <w:rPr>
           <w:lang w:val="ru-RU"/>
         </w:rPr>
-        <w:t xml:space="preserve">Шмелёв А. Г. Психологические тесты: от разработки до применения. — М.: Институт психологии РАН, 2013. — 400 с. — ISBN 978-5-9270-0252-7. (Общие вопросы </w:t>
-      </w:r>
-      <w:proofErr w:type="spellStart"/>
-      <w:r>
-        <w:rPr>
-          <w:lang w:val="ru-RU"/>
-        </w:rPr>
-        <w:t>психометрики</w:t>
-      </w:r>
-      <w:proofErr w:type="spellEnd"/>
-      <w:r>
-        <w:rPr>
-          <w:lang w:val="ru-RU"/>
-        </w:rPr>
-        <w:t xml:space="preserve">, валидности и надёжности тестов, которые можно </w:t>
+        <w:t xml:space="preserve">Шмелёв А. Г. Психологические тесты: от разработки до применения. — М.: Институт психологии РАН, 2013. — 400 с. — ISBN 978-5-9270-0252-7. (Общие вопросы психометрики, валидности и надёжности тестов, которые можно </w:t>
       </w:r>
       <w:r>
         <w:rPr>
@@ -7184,6 +5853,28 @@
       </w:pPr>
       <w:r>
         <w:continuationSeparator/>
+      </w:r>
+    </w:p>
+  </w:footnote>
+  <w:footnote w:id="1">
+    <w:p>
+      <w:pPr>
+        <w:pStyle w:val="ad"/>
+      </w:pPr>
+      <w:r>
+        <w:rPr>
+          <w:rStyle w:val="a3"/>
+        </w:rPr>
+        <w:footnoteRef/>
+      </w:r>
+      <w:r>
+        <w:t xml:space="preserve"> Дуплей Максим Игоревич, старший преподаватель информационных технологий, методист</w:t>
+      </w:r>
+      <w:r>
+        <w:t xml:space="preserve">, </w:t>
+      </w:r>
+      <w:r>
+        <w:t>Академия Управления и Производства</w:t>
       </w:r>
     </w:p>
   </w:footnote>
@@ -13431,6 +12122,7 @@
   <w:style w:type="character" w:default="1" w:styleId="a0">
     <w:name w:val="Default Paragraph Font"/>
     <w:uiPriority w:val="1"/>
+    <w:semiHidden/>
     <w:unhideWhenUsed/>
   </w:style>
   <w:style w:type="table" w:default="1" w:styleId="a1">
@@ -13456,6 +12148,7 @@
   </w:style>
   <w:style w:type="character" w:styleId="a3">
     <w:name w:val="footnote reference"/>
+    <w:uiPriority w:val="99"/>
     <w:semiHidden/>
     <w:unhideWhenUsed/>
     <w:rPr>
@@ -13629,6 +12322,39 @@
     <w:link w:val="ab"/>
     <w:uiPriority w:val="99"/>
     <w:rsid w:val="001C5DFB"/>
+  </w:style>
+  <w:style w:type="paragraph" w:styleId="ad">
+    <w:name w:val="footnote text"/>
+    <w:link w:val="ae"/>
+    <w:uiPriority w:val="99"/>
+    <w:semiHidden/>
+    <w:unhideWhenUsed/>
+    <w:rsid w:val="008B6200"/>
+    <w:pPr>
+      <w:spacing w:after="0" w:line="240" w:lineRule="auto"/>
+    </w:pPr>
+    <w:rPr>
+      <w:rFonts w:eastAsia="Times New Roman"/>
+      <w:color w:val="auto"/>
+      <w:sz w:val="20"/>
+      <w:szCs w:val="20"/>
+      <w:lang w:val="ru-RU"/>
+    </w:rPr>
+  </w:style>
+  <w:style w:type="character" w:customStyle="1" w:styleId="ae">
+    <w:name w:val="Текст сноски Знак"/>
+    <w:basedOn w:val="a0"/>
+    <w:link w:val="ad"/>
+    <w:uiPriority w:val="99"/>
+    <w:semiHidden/>
+    <w:rsid w:val="008B6200"/>
+    <w:rPr>
+      <w:rFonts w:eastAsia="Times New Roman"/>
+      <w:color w:val="auto"/>
+      <w:sz w:val="20"/>
+      <w:szCs w:val="20"/>
+      <w:lang w:val="ru-RU"/>
+    </w:rPr>
   </w:style>
 </w:styles>
 </file>

</xml_diff>